<commit_message>
[L1.2 | L2.1] | Some changes in reports
- Some changes in reports
- The methodology in L2.1 work has been changed
</commit_message>
<xml_diff>
--- a/L2.1/L2.1.docx
+++ b/L2.1/L2.1.docx
@@ -1319,25 +1319,7 @@
         <w:rPr>
           <w:lang w:val="uk-UA" w:eastAsia="ru-RU"/>
         </w:rPr>
-        <w:t>На базі попередньої роботи необхідно розробити програмний додаток для</w:t>
-      </w:r>
-      <w:r>
-        <w:rPr>
-          <w:lang w:val="uk-UA" w:eastAsia="ru-RU"/>
-        </w:rPr>
-        <w:t xml:space="preserve"> моделювання балістичного руху </w:t>
-      </w:r>
-      <w:r>
-        <w:rPr>
-          <w:lang w:val="en-US" w:eastAsia="ru-RU"/>
-        </w:rPr>
-        <w:t>–</w:t>
-      </w:r>
-      <w:r>
-        <w:rPr>
-          <w:lang w:val="uk-UA" w:eastAsia="ru-RU"/>
-        </w:rPr>
-        <w:t xml:space="preserve"> руху тіла, кинутого під кутом до горизонту в полі тяжіння.</w:t>
+        <w:t>На базі попередньої роботи необхідно розробити програмний додаток для моделювання балістичного руху — руху тіла, кинутого під кутом до горизонту в полі тяжіння.</w:t>
       </w:r>
       <w:r>
         <w:rPr>
@@ -1443,13 +1425,6 @@
         <w:t>​,</w:t>
       </w:r>
       <m:oMath>
-        <m:r>
-          <w:rPr>
-            <w:rFonts w:ascii="Cambria Math" w:hAnsi="Cambria Math"/>
-            <w:lang w:val="uk-UA" w:eastAsia="ru-RU"/>
-          </w:rPr>
-          <m:t xml:space="preserve"> </m:t>
-        </m:r>
         <m:sSub>
           <m:sSubPr>
             <m:ctrlPr>
@@ -1607,8 +1582,6 @@
         </w:rPr>
         <w:t>).</w:t>
       </w:r>
-      <w:bookmarkStart w:id="3" w:name="_GoBack"/>
-      <w:bookmarkEnd w:id="3"/>
     </w:p>
     <w:p>
       <w:pPr>
@@ -1617,14 +1590,14 @@
           <w:lang w:val="uk-UA"/>
         </w:rPr>
       </w:pPr>
-      <w:bookmarkStart w:id="4" w:name="_Toc225270438"/>
+      <w:bookmarkStart w:id="3" w:name="_Toc225270438"/>
       <w:r>
         <w:rPr>
           <w:lang w:val="uk-UA"/>
         </w:rPr>
         <w:t>Вимоги щодо функціоналу програми</w:t>
       </w:r>
-      <w:bookmarkEnd w:id="4"/>
+      <w:bookmarkEnd w:id="3"/>
     </w:p>
     <w:p>
       <w:pPr>
@@ -1924,31 +1897,167 @@
           <w:lang w:val="uk-UA"/>
         </w:rPr>
       </w:pPr>
-      <w:bookmarkStart w:id="5" w:name="_Toc225270439"/>
+      <w:bookmarkStart w:id="4" w:name="_Toc225270439"/>
       <w:r>
         <w:rPr>
           <w:lang w:val="uk-UA"/>
         </w:rPr>
         <w:lastRenderedPageBreak/>
         <w:t>Методологія вирішення задачі</w:t>
+      </w:r>
+      <w:bookmarkEnd w:id="4"/>
+    </w:p>
+    <w:p>
+      <w:pPr>
+        <w:pStyle w:val="2"/>
+        <w:rPr>
+          <w:lang w:val="uk-UA"/>
+        </w:rPr>
+      </w:pPr>
+      <w:bookmarkStart w:id="5" w:name="_Toc225270440"/>
+      <w:r>
+        <w:rPr>
+          <w:lang w:val="uk-UA"/>
+        </w:rPr>
+        <w:t>Методологія розробки програмного забезпечення</w:t>
       </w:r>
       <w:bookmarkEnd w:id="5"/>
     </w:p>
     <w:p>
       <w:pPr>
-        <w:pStyle w:val="2"/>
-        <w:rPr>
-          <w:lang w:val="uk-UA"/>
-        </w:rPr>
-      </w:pPr>
-      <w:bookmarkStart w:id="6" w:name="_Toc225270440"/>
-      <w:r>
-        <w:rPr>
-          <w:lang w:val="uk-UA"/>
-        </w:rPr>
-        <w:t>Методологія розробки програмного забезпечення</w:t>
-      </w:r>
-      <w:bookmarkEnd w:id="6"/>
+        <w:ind w:firstLine="708"/>
+        <w:rPr>
+          <w:lang w:val="uk-UA" w:eastAsia="ru-RU"/>
+        </w:rPr>
+      </w:pPr>
+      <w:r>
+        <w:rPr>
+          <w:lang w:val="uk-UA" w:eastAsia="ru-RU"/>
+        </w:rPr>
+        <w:t xml:space="preserve">В якості основи для виконання цієї лабораторної роботи було обрано методологію </w:t>
+      </w:r>
+      <w:r>
+        <w:rPr>
+          <w:lang w:val="uk-UA" w:eastAsia="ru-RU"/>
+        </w:rPr>
+        <w:t>«</w:t>
+      </w:r>
+      <w:r>
+        <w:rPr>
+          <w:lang w:val="uk-UA" w:eastAsia="ru-RU"/>
+        </w:rPr>
+        <w:t>Екстремального програ</w:t>
+      </w:r>
+      <w:r>
+        <w:rPr>
+          <w:lang w:val="uk-UA" w:eastAsia="ru-RU"/>
+        </w:rPr>
+        <w:t>мування</w:t>
+      </w:r>
+      <w:r>
+        <w:rPr>
+          <w:lang w:val="uk-UA" w:eastAsia="ru-RU"/>
+        </w:rPr>
+        <w:t>»</w:t>
+      </w:r>
+      <w:r>
+        <w:rPr>
+          <w:lang w:val="uk-UA" w:eastAsia="ru-RU"/>
+        </w:rPr>
+        <w:t xml:space="preserve"> (</w:t>
+      </w:r>
+      <w:r>
+        <w:rPr>
+          <w:lang w:val="en-US" w:eastAsia="ru-RU"/>
+        </w:rPr>
+        <w:t xml:space="preserve">AKA </w:t>
+      </w:r>
+      <w:r>
+        <w:rPr>
+          <w:lang w:val="uk-UA" w:eastAsia="ru-RU"/>
+        </w:rPr>
+        <w:t>«</w:t>
+      </w:r>
+      <w:proofErr w:type="spellStart"/>
+      <w:r>
+        <w:rPr>
+          <w:lang w:val="uk-UA" w:eastAsia="ru-RU"/>
+        </w:rPr>
+        <w:t>Extreme</w:t>
+      </w:r>
+      <w:proofErr w:type="spellEnd"/>
+      <w:r>
+        <w:rPr>
+          <w:lang w:val="uk-UA" w:eastAsia="ru-RU"/>
+        </w:rPr>
+        <w:t xml:space="preserve"> </w:t>
+      </w:r>
+      <w:proofErr w:type="spellStart"/>
+      <w:r>
+        <w:rPr>
+          <w:lang w:val="uk-UA" w:eastAsia="ru-RU"/>
+        </w:rPr>
+        <w:t>Programming</w:t>
+      </w:r>
+      <w:proofErr w:type="spellEnd"/>
+      <w:r>
+        <w:rPr>
+          <w:lang w:val="uk-UA" w:eastAsia="ru-RU"/>
+        </w:rPr>
+        <w:t xml:space="preserve">», далі - </w:t>
+      </w:r>
+      <w:r>
+        <w:rPr>
+          <w:lang w:val="en-US" w:eastAsia="ru-RU"/>
+        </w:rPr>
+        <w:t>XP</w:t>
+      </w:r>
+      <w:r>
+        <w:rPr>
+          <w:lang w:val="uk-UA" w:eastAsia="ru-RU"/>
+        </w:rPr>
+        <w:t xml:space="preserve">), яка </w:t>
+      </w:r>
+      <w:r>
+        <w:rPr>
+          <w:lang w:val="uk-UA" w:eastAsia="ru-RU"/>
+        </w:rPr>
+        <w:t xml:space="preserve">фактично є підпунктом підходу </w:t>
+      </w:r>
+      <w:proofErr w:type="spellStart"/>
+      <w:r>
+        <w:rPr>
+          <w:lang w:val="uk-UA" w:eastAsia="ru-RU"/>
+        </w:rPr>
+        <w:t>Agile</w:t>
+      </w:r>
+      <w:proofErr w:type="spellEnd"/>
+      <w:r>
+        <w:rPr>
+          <w:lang w:eastAsia="ru-RU"/>
+        </w:rPr>
+        <w:t xml:space="preserve"> (</w:t>
+      </w:r>
+      <w:proofErr w:type="spellStart"/>
+      <w:r>
+        <w:rPr>
+          <w:lang w:val="uk-UA" w:eastAsia="ru-RU"/>
+        </w:rPr>
+        <w:t>гибкого</w:t>
+      </w:r>
+      <w:proofErr w:type="spellEnd"/>
+      <w:r>
+        <w:rPr>
+          <w:lang w:val="uk-UA" w:eastAsia="ru-RU"/>
+        </w:rPr>
+        <w:t xml:space="preserve"> підходу)</w:t>
+      </w:r>
+      <w:r>
+        <w:rPr>
+          <w:lang w:val="uk-UA" w:eastAsia="ru-RU"/>
+        </w:rPr>
+        <w:t>.</w:t>
+      </w:r>
     </w:p>
     <w:p>
       <w:pPr>
@@ -1961,21 +2070,13 @@
         <w:rPr>
           <w:lang w:val="uk-UA" w:eastAsia="ru-RU"/>
         </w:rPr>
-        <w:t xml:space="preserve">Оскільки реалізація програми складається з кількох незалежних модулів (графічний інтерфейс, математичне ядро та візуалізація), які згодом будуть об'єднані для спільної роботи, вибір методології схиляється до найбільш логічного та гнучкого варіанту – </w:t>
-      </w:r>
-      <w:proofErr w:type="spellStart"/>
-      <w:r>
-        <w:rPr>
-          <w:lang w:val="uk-UA" w:eastAsia="ru-RU"/>
-        </w:rPr>
-        <w:t>ітеративно-інкрементного</w:t>
-      </w:r>
-      <w:proofErr w:type="spellEnd"/>
-      <w:r>
-        <w:rPr>
-          <w:lang w:val="uk-UA" w:eastAsia="ru-RU"/>
-        </w:rPr>
-        <w:t xml:space="preserve"> методу розробки.</w:t>
+        <w:t>У своєму класичному вигляді XP являє собою комплексну методологію, яка включає такі практики, як парне програмування, розробка через тестування, часті релізи та щод</w:t>
+      </w:r>
+      <w:r>
+        <w:rPr>
+          <w:lang w:val="uk-UA" w:eastAsia="ru-RU"/>
+        </w:rPr>
+        <w:t>енна комунікація із замовником.</w:t>
       </w:r>
     </w:p>
     <w:p>
@@ -1987,51 +2088,108 @@
       </w:pPr>
       <w:r>
         <w:rPr>
-          <w:lang w:val="uk-UA" w:eastAsia="ru-RU"/>
-        </w:rPr>
-        <w:t xml:space="preserve">Функціонал буде розроблятися та публікуватися у </w:t>
+          <w:b/>
+          <w:i/>
+          <w:lang w:val="uk-UA" w:eastAsia="ru-RU"/>
+        </w:rPr>
+        <w:t>ОДНАК</w:t>
+      </w:r>
+      <w:r>
+        <w:rPr>
+          <w:b/>
+          <w:i/>
+          <w:lang w:val="uk-UA" w:eastAsia="ru-RU"/>
+        </w:rPr>
+        <w:t>!!</w:t>
+      </w:r>
+      <w:r>
+        <w:rPr>
+          <w:b/>
+          <w:i/>
+          <w:lang w:val="uk-UA" w:eastAsia="ru-RU"/>
+        </w:rPr>
+        <w:t>!</w:t>
+      </w:r>
+      <w:r>
+        <w:rPr>
+          <w:lang w:val="uk-UA" w:eastAsia="ru-RU"/>
+        </w:rPr>
+        <w:t xml:space="preserve"> У рамках даної лабораторної роботи </w:t>
+      </w:r>
+      <w:r>
+        <w:rPr>
+          <w:i/>
+          <w:lang w:val="uk-UA" w:eastAsia="ru-RU"/>
+        </w:rPr>
+        <w:t>я не буду</w:t>
+      </w:r>
+      <w:r>
+        <w:rPr>
+          <w:lang w:val="uk-UA" w:eastAsia="ru-RU"/>
+        </w:rPr>
+        <w:t xml:space="preserve"> використовувати весь цей спектр інструментів, оскільки </w:t>
+      </w:r>
+      <w:r>
+        <w:rPr>
+          <w:lang w:val="uk-UA" w:eastAsia="ru-RU"/>
+        </w:rPr>
+        <w:t xml:space="preserve">наразі </w:t>
+      </w:r>
+      <w:r>
+        <w:rPr>
+          <w:lang w:val="uk-UA" w:eastAsia="ru-RU"/>
+        </w:rPr>
+        <w:t xml:space="preserve">для моєї задачі </w:t>
+      </w:r>
+      <w:r>
+        <w:rPr>
+          <w:lang w:val="uk-UA" w:eastAsia="ru-RU"/>
+        </w:rPr>
+        <w:t xml:space="preserve">вони є надлишковими. Замість цього </w:t>
+      </w:r>
+      <w:r>
+        <w:rPr>
+          <w:lang w:val="uk-UA" w:eastAsia="ru-RU"/>
+        </w:rPr>
+        <w:t>я запозичу</w:t>
+      </w:r>
+      <w:r>
+        <w:rPr>
+          <w:lang w:val="uk-UA" w:eastAsia="ru-RU"/>
+        </w:rPr>
+        <w:t xml:space="preserve"> з XP лише одну, але найбіль</w:t>
+      </w:r>
+      <w:r>
+        <w:rPr>
+          <w:lang w:val="uk-UA" w:eastAsia="ru-RU"/>
+        </w:rPr>
+        <w:t xml:space="preserve">ш релевантну для мене практику – </w:t>
+      </w:r>
+      <w:r>
+        <w:rPr>
+          <w:lang w:val="uk-UA" w:eastAsia="ru-RU"/>
+        </w:rPr>
+        <w:t xml:space="preserve">безперервний </w:t>
       </w:r>
       <w:proofErr w:type="spellStart"/>
       <w:r>
         <w:rPr>
           <w:lang w:val="uk-UA" w:eastAsia="ru-RU"/>
         </w:rPr>
-        <w:t>репозиторії</w:t>
+        <w:t>рефакт</w:t>
+      </w:r>
+      <w:r>
+        <w:rPr>
+          <w:lang w:val="uk-UA" w:eastAsia="ru-RU"/>
+        </w:rPr>
+        <w:t>оринг</w:t>
       </w:r>
       <w:proofErr w:type="spellEnd"/>
       <w:r>
         <w:rPr>
           <w:lang w:val="uk-UA" w:eastAsia="ru-RU"/>
         </w:rPr>
-        <w:t xml:space="preserve"> </w:t>
-      </w:r>
-      <w:proofErr w:type="spellStart"/>
-      <w:r>
-        <w:rPr>
-          <w:lang w:val="uk-UA" w:eastAsia="ru-RU"/>
-        </w:rPr>
-        <w:t>GitHub</w:t>
-      </w:r>
-      <w:proofErr w:type="spellEnd"/>
-      <w:r>
-        <w:rPr>
-          <w:lang w:val="uk-UA" w:eastAsia="ru-RU"/>
-        </w:rPr>
-        <w:t xml:space="preserve"> поступово, окремими частинами. Кожен наступний </w:t>
-      </w:r>
-      <w:proofErr w:type="spellStart"/>
-      <w:r>
-        <w:rPr>
-          <w:lang w:val="uk-UA" w:eastAsia="ru-RU"/>
-        </w:rPr>
-        <w:t>комміт</w:t>
-      </w:r>
-      <w:proofErr w:type="spellEnd"/>
-      <w:r>
-        <w:rPr>
-          <w:lang w:val="uk-UA" w:eastAsia="ru-RU"/>
-        </w:rPr>
-        <w:t xml:space="preserve"> міститиме стабільно працюючу частину певного модуля, і так триватиме до повного збирання програми. Наприкінці буде проведено фінальне доопрацювання всіх модулів, тестування та виправлення недоліків, які могли бути упущені на етапах розробки. Після цього етапу розробку програми можна вважати успішно завершеною.</w:t>
+        <w:t>.</w:t>
       </w:r>
     </w:p>
     <w:p>
@@ -2045,24 +2203,230 @@
         <w:rPr>
           <w:lang w:val="uk-UA" w:eastAsia="ru-RU"/>
         </w:rPr>
-        <w:t>Порядок розробки модулів може варіюватися залежно від складності, проте найефективнішим алгоритмом для даної задачі є такий: спочатку створюється математична логіка (обчислення координат), далі розробляється макет та дизайн вікна програми, після чого реалізується зчитування введених даних з інтерфейсу, і наостанок – імплементація виведення оброблених даних на інтерактивний графік.</w:t>
+        <w:t>Оскільки розробка ведеться не з нуля, а на основі вже</w:t>
+      </w:r>
+      <w:r>
+        <w:rPr>
+          <w:lang w:val="uk-UA" w:eastAsia="ru-RU"/>
+        </w:rPr>
+        <w:t xml:space="preserve"> існуючої роботи</w:t>
+      </w:r>
+      <w:r>
+        <w:rPr>
+          <w:lang w:val="uk-UA" w:eastAsia="ru-RU"/>
+        </w:rPr>
+        <w:t>, саме ця модель дозволяє офіційно та безпечно змінювати архітектуру програми стільки разів, скільки потрі</w:t>
+      </w:r>
+      <w:r>
+        <w:rPr>
+          <w:lang w:val="uk-UA" w:eastAsia="ru-RU"/>
+        </w:rPr>
+        <w:t xml:space="preserve">бно для впровадження нових </w:t>
+      </w:r>
+      <w:proofErr w:type="spellStart"/>
+      <w:r>
+        <w:rPr>
+          <w:lang w:val="uk-UA" w:eastAsia="ru-RU"/>
+        </w:rPr>
+        <w:t>фіч</w:t>
+      </w:r>
+      <w:proofErr w:type="spellEnd"/>
+      <w:r>
+        <w:rPr>
+          <w:lang w:val="uk-UA" w:eastAsia="ru-RU"/>
+        </w:rPr>
+        <w:t>.</w:t>
       </w:r>
     </w:p>
     <w:p>
       <w:pPr>
+        <w:ind w:firstLine="708"/>
+        <w:rPr>
+          <w:lang w:val="uk-UA" w:eastAsia="ru-RU"/>
+        </w:rPr>
+      </w:pPr>
+      <w:r>
+        <w:rPr>
+          <w:lang w:val="uk-UA" w:eastAsia="ru-RU"/>
+        </w:rPr>
+        <w:t>Завдяки</w:t>
+      </w:r>
+      <w:r>
+        <w:rPr>
+          <w:lang w:val="uk-UA" w:eastAsia="ru-RU"/>
+        </w:rPr>
+        <w:t xml:space="preserve"> цьому</w:t>
+      </w:r>
+      <w:r>
+        <w:rPr>
+          <w:lang w:val="uk-UA" w:eastAsia="ru-RU"/>
+        </w:rPr>
+        <w:t>, процес роз</w:t>
+      </w:r>
+      <w:r>
+        <w:rPr>
+          <w:lang w:val="uk-UA" w:eastAsia="ru-RU"/>
+        </w:rPr>
+        <w:t xml:space="preserve">робки </w:t>
+      </w:r>
+      <w:r>
+        <w:rPr>
+          <w:lang w:val="uk-UA" w:eastAsia="ru-RU"/>
+        </w:rPr>
+        <w:t>буде виглядати наступним чином:</w:t>
+      </w:r>
+    </w:p>
+    <w:p>
+      <w:pPr>
+        <w:pStyle w:val="ab"/>
+        <w:numPr>
+          <w:ilvl w:val="0"/>
+          <w:numId w:val="2"/>
+        </w:numPr>
+        <w:rPr>
+          <w:lang w:val="uk-UA" w:eastAsia="ru-RU"/>
+        </w:rPr>
+      </w:pPr>
+      <w:r>
+        <w:rPr>
+          <w:lang w:val="uk-UA" w:eastAsia="ru-RU"/>
+        </w:rPr>
+        <w:t>А</w:t>
+      </w:r>
+      <w:r>
+        <w:rPr>
+          <w:lang w:val="uk-UA" w:eastAsia="ru-RU"/>
+        </w:rPr>
+        <w:t>наліз недоліків старої системи.</w:t>
+      </w:r>
+    </w:p>
+    <w:p>
+      <w:pPr>
+        <w:pStyle w:val="ab"/>
+        <w:numPr>
+          <w:ilvl w:val="0"/>
+          <w:numId w:val="2"/>
+        </w:numPr>
+        <w:rPr>
+          <w:lang w:val="uk-UA" w:eastAsia="ru-RU"/>
+        </w:rPr>
+      </w:pPr>
+      <w:proofErr w:type="spellStart"/>
+      <w:r>
+        <w:rPr>
+          <w:lang w:val="uk-UA" w:eastAsia="ru-RU"/>
+        </w:rPr>
+        <w:t>Рефакторинг</w:t>
+      </w:r>
+      <w:proofErr w:type="spellEnd"/>
+      <w:r>
+        <w:rPr>
+          <w:lang w:eastAsia="ru-RU"/>
+        </w:rPr>
+        <w:t xml:space="preserve"> </w:t>
+      </w:r>
+      <w:r>
+        <w:rPr>
+          <w:lang w:val="en-US" w:eastAsia="ru-RU"/>
+        </w:rPr>
+        <w:t>mathModule.py</w:t>
+      </w:r>
+      <w:r>
+        <w:rPr>
+          <w:lang w:val="uk-UA" w:eastAsia="ru-RU"/>
+        </w:rPr>
+        <w:t xml:space="preserve"> (зміна формул та</w:t>
+      </w:r>
+      <w:r>
+        <w:rPr>
+          <w:lang w:val="uk-UA" w:eastAsia="ru-RU"/>
+        </w:rPr>
+        <w:t xml:space="preserve"> даних, які будуть віддаватися у інтерфейс</w:t>
+      </w:r>
+      <w:r>
+        <w:rPr>
+          <w:lang w:val="uk-UA" w:eastAsia="ru-RU"/>
+        </w:rPr>
+        <w:t>)</w:t>
+      </w:r>
+    </w:p>
+    <w:p>
+      <w:pPr>
+        <w:pStyle w:val="ab"/>
+        <w:numPr>
+          <w:ilvl w:val="0"/>
+          <w:numId w:val="2"/>
+        </w:numPr>
+        <w:rPr>
+          <w:lang w:val="uk-UA" w:eastAsia="ru-RU"/>
+        </w:rPr>
+      </w:pPr>
+      <w:r>
+        <w:rPr>
+          <w:lang w:val="uk-UA" w:eastAsia="ru-RU"/>
+        </w:rPr>
+        <w:t xml:space="preserve">Впровадження нового функціоналу (система </w:t>
+      </w:r>
+      <w:proofErr w:type="spellStart"/>
+      <w:r>
+        <w:rPr>
+          <w:lang w:val="uk-UA" w:eastAsia="ru-RU"/>
+        </w:rPr>
+        <w:t>валідації</w:t>
+      </w:r>
+      <w:proofErr w:type="spellEnd"/>
+      <w:r>
+        <w:rPr>
+          <w:lang w:val="uk-UA" w:eastAsia="ru-RU"/>
+        </w:rPr>
+        <w:t>, інформаційні панелі, тощо</w:t>
+      </w:r>
+      <w:r>
+        <w:rPr>
+          <w:lang w:val="uk-UA" w:eastAsia="ru-RU"/>
+        </w:rPr>
+        <w:t xml:space="preserve">) на вже оновлений </w:t>
+      </w:r>
+      <w:r>
+        <w:rPr>
+          <w:lang w:val="uk-UA" w:eastAsia="ru-RU"/>
+        </w:rPr>
+        <w:t>«</w:t>
+      </w:r>
+      <w:r>
+        <w:rPr>
+          <w:lang w:val="uk-UA" w:eastAsia="ru-RU"/>
+        </w:rPr>
+        <w:t>фундамент</w:t>
+      </w:r>
+      <w:r>
+        <w:rPr>
+          <w:lang w:val="uk-UA" w:eastAsia="ru-RU"/>
+        </w:rPr>
+        <w:t>»</w:t>
+      </w:r>
+      <w:r>
+        <w:rPr>
+          <w:lang w:val="uk-UA" w:eastAsia="ru-RU"/>
+        </w:rPr>
+        <w:t xml:space="preserve"> програми.</w:t>
+      </w:r>
+    </w:p>
+    <w:p>
+      <w:pPr>
         <w:pStyle w:val="2"/>
         <w:rPr>
           <w:lang w:val="uk-UA"/>
         </w:rPr>
       </w:pPr>
-      <w:bookmarkStart w:id="7" w:name="_Toc225270441"/>
+      <w:bookmarkStart w:id="6" w:name="_Toc225270441"/>
       <w:r>
         <w:rPr>
           <w:lang w:val="uk-UA"/>
         </w:rPr>
         <w:t>Фізична/математична модель руху</w:t>
       </w:r>
-      <w:bookmarkEnd w:id="7"/>
+      <w:bookmarkEnd w:id="6"/>
     </w:p>
     <w:p>
       <w:pPr>
@@ -2489,6 +2853,7 @@
         <w:rPr>
           <w:lang w:val="uk-UA"/>
         </w:rPr>
+        <w:lastRenderedPageBreak/>
         <w:t xml:space="preserve">Моделювання руху відбувається </w:t>
       </w:r>
       <w:proofErr w:type="spellStart"/>
@@ -2503,14 +2868,7 @@
         <w:rPr>
           <w:lang w:val="uk-UA"/>
         </w:rPr>
-        <w:t xml:space="preserve">. Програма не розраховує безперервну криву, а вираховує координати тіла лише у фіксовані моменти </w:t>
-      </w:r>
-      <w:r>
-        <w:rPr>
-          <w:lang w:val="uk-UA"/>
-        </w:rPr>
-        <w:lastRenderedPageBreak/>
-        <w:t xml:space="preserve">часу з певним інтервалом (кроком) </w:t>
+        <w:t xml:space="preserve">. Програма не розраховує безперервну криву, а вираховує координати тіла лише у фіксовані моменти часу з певним інтервалом (кроком) </w:t>
       </w:r>
       <m:oMath>
         <m:r>
@@ -3034,7 +3392,7 @@
           <w:lang w:val="uk-UA"/>
         </w:rPr>
       </w:pPr>
-      <w:bookmarkStart w:id="8" w:name="_Toc225270442"/>
+      <w:bookmarkStart w:id="7" w:name="_Toc225270442"/>
       <w:r>
         <w:rPr>
           <w:rStyle w:val="citation-111"/>
@@ -3042,7 +3400,7 @@
         </w:rPr>
         <w:t>Умова завершення польоту</w:t>
       </w:r>
-      <w:bookmarkEnd w:id="8"/>
+      <w:bookmarkEnd w:id="7"/>
     </w:p>
     <w:p>
       <w:pPr>
@@ -3258,7 +3616,7 @@
           <w:lang w:val="uk-UA"/>
         </w:rPr>
       </w:pPr>
-      <w:bookmarkStart w:id="9" w:name="_Toc225270443"/>
+      <w:bookmarkStart w:id="8" w:name="_Toc225270443"/>
       <w:r>
         <w:rPr>
           <w:rFonts w:eastAsiaTheme="minorEastAsia"/>
@@ -3266,7 +3624,7 @@
         </w:rPr>
         <w:t>Програмна реалізація алгоритму</w:t>
       </w:r>
-      <w:bookmarkEnd w:id="9"/>
+      <w:bookmarkEnd w:id="8"/>
     </w:p>
     <w:p>
       <w:pPr>
@@ -3622,6 +3980,7 @@
           <w:b/>
           <w:lang w:val="uk-UA" w:eastAsia="ru-RU"/>
         </w:rPr>
+        <w:lastRenderedPageBreak/>
         <w:t>Розрахунок координат:</w:t>
       </w:r>
       <w:r>
@@ -3657,7 +4016,6 @@
           <w:b/>
           <w:lang w:val="uk-UA" w:eastAsia="ru-RU"/>
         </w:rPr>
-        <w:lastRenderedPageBreak/>
         <w:t>Пошук моменту падіння:</w:t>
       </w:r>
       <w:r>
@@ -3818,7 +4176,7 @@
           <w:lang w:val="uk-UA"/>
         </w:rPr>
       </w:pPr>
-      <w:bookmarkStart w:id="10" w:name="_Toc225270444"/>
+      <w:bookmarkStart w:id="9" w:name="_Toc225270444"/>
       <w:r>
         <w:rPr>
           <w:rFonts w:eastAsiaTheme="minorEastAsia"/>
@@ -3840,7 +4198,7 @@
         </w:rPr>
         <w:t>)</w:t>
       </w:r>
-      <w:bookmarkEnd w:id="10"/>
+      <w:bookmarkEnd w:id="9"/>
     </w:p>
     <w:p>
       <w:pPr>
@@ -6296,7 +6654,7 @@
           <w:lang w:val="uk-UA"/>
         </w:rPr>
       </w:pPr>
-      <w:bookmarkStart w:id="11" w:name="_Toc225270445"/>
+      <w:bookmarkStart w:id="10" w:name="_Toc225270445"/>
       <w:r>
         <w:rPr>
           <w:lang w:val="uk-UA"/>
@@ -6304,7 +6662,7 @@
         <w:lastRenderedPageBreak/>
         <w:t>Висновок</w:t>
       </w:r>
-      <w:bookmarkEnd w:id="11"/>
+      <w:bookmarkEnd w:id="10"/>
     </w:p>
     <w:p>
       <w:pPr>
@@ -6337,7 +6695,25 @@
         <w:rPr>
           <w:lang w:val="uk-UA" w:eastAsia="ru-RU"/>
         </w:rPr>
-        <w:t xml:space="preserve"> Стек і методологія залишилися такими, якими і були, змінилася тільки логіка знаходження координат (формули), а також трохи дані, які передаються у інтерфейс (не сильно змінюючи його логіку)</w:t>
+        <w:t xml:space="preserve"> </w:t>
+      </w:r>
+      <w:r>
+        <w:rPr>
+          <w:lang w:val="uk-UA" w:eastAsia="ru-RU"/>
+        </w:rPr>
+        <w:t>Стек залишився таким, яким і був</w:t>
+      </w:r>
+      <w:r>
+        <w:rPr>
+          <w:lang w:val="uk-UA" w:eastAsia="ru-RU"/>
+        </w:rPr>
+        <w:t>, змінилася тільки логіка знаходження координат (формули), а також трохи дані, які передаються у інтерфейс (не сильно змінюючи його логіку)</w:t>
+      </w:r>
+      <w:r>
+        <w:rPr>
+          <w:lang w:val="uk-UA" w:eastAsia="ru-RU"/>
+        </w:rPr>
+        <w:t xml:space="preserve"> та методологія (адже завдання того потребує)</w:t>
       </w:r>
     </w:p>
     <w:p>
@@ -6379,7 +6755,15 @@
         <w:rPr>
           <w:lang w:val="uk-UA" w:eastAsia="ru-RU"/>
         </w:rPr>
-        <w:t xml:space="preserve"> (фактично, немає необхідності робити 5 </w:t>
+        <w:t xml:space="preserve"> (фактично, немає необхідності </w:t>
+      </w:r>
+      <w:bookmarkStart w:id="11" w:name="_GoBack"/>
+      <w:bookmarkEnd w:id="11"/>
+      <w:r>
+        <w:rPr>
+          <w:lang w:val="uk-UA" w:eastAsia="ru-RU"/>
+        </w:rPr>
+        <w:t xml:space="preserve">робити 5 </w:t>
       </w:r>
       <w:proofErr w:type="spellStart"/>
       <w:r>
@@ -6476,7 +6860,7 @@
           <w:rPr>
             <w:noProof/>
           </w:rPr>
-          <w:t>7</w:t>
+          <w:t>6</w:t>
         </w:r>
         <w:r>
           <w:fldChar w:fldCharType="end"/>
@@ -6535,7 +6919,7 @@
         <w:rFonts w:ascii="Times New Roman" w:eastAsiaTheme="minorHAnsi" w:hAnsi="Times New Roman" w:cs="Times New Roman" w:hint="default"/>
       </w:rPr>
     </w:lvl>
-    <w:lvl w:ilvl="1" w:tplc="04190003" w:tentative="1">
+    <w:lvl w:ilvl="1" w:tplc="04190003">
       <w:start w:val="1"/>
       <w:numFmt w:val="bullet"/>
       <w:lvlText w:val="o"/>
@@ -8288,7 +8672,7 @@
 </file>
 
 <file path=customXml/itemProps1.xml><?xml version="1.0" encoding="utf-8"?>
-<ds:datastoreItem xmlns:ds="http://schemas.openxmlformats.org/officeDocument/2006/customXml" ds:itemID="{BCAB7DCB-9FB9-460E-AD54-7786CB587973}">
+<ds:datastoreItem xmlns:ds="http://schemas.openxmlformats.org/officeDocument/2006/customXml" ds:itemID="{23F31A6D-F0D7-4D82-A024-FE3E91C6786A}">
   <ds:schemaRefs>
     <ds:schemaRef ds:uri="http://schemas.openxmlformats.org/officeDocument/2006/bibliography"/>
   </ds:schemaRefs>

</xml_diff>

<commit_message>
[L2.1] | The methodology has been updated
- a bit of theory and water has been added
- 100 blacks are walking through the desert, they meet a genie, 99 wish to be white, and the hundredth, laughing his head off, wishes that they would all become black again.
</commit_message>
<xml_diff>
--- a/L2.1/L2.1.docx
+++ b/L2.1/L2.1.docx
@@ -495,7 +495,7 @@
           <w:r>
             <w:fldChar w:fldCharType="separate"/>
           </w:r>
-          <w:hyperlink w:anchor="_Toc225270435" w:history="1">
+          <w:hyperlink w:anchor="_Toc225603944" w:history="1">
             <w:r>
               <w:rPr>
                 <w:rStyle w:val="a6"/>
@@ -518,7 +518,7 @@
               <w:rPr>
                 <w:webHidden/>
               </w:rPr>
-              <w:instrText xml:space="preserve"> PAGEREF _Toc225270435 \h </w:instrText>
+              <w:instrText xml:space="preserve"> PAGEREF _Toc225603944 \h </w:instrText>
             </w:r>
             <w:r>
               <w:rPr>
@@ -558,7 +558,7 @@
               <w:lang w:eastAsia="ru-RU"/>
             </w:rPr>
           </w:pPr>
-          <w:hyperlink w:anchor="_Toc225270436" w:history="1">
+          <w:hyperlink w:anchor="_Toc225603945" w:history="1">
             <w:r>
               <w:rPr>
                 <w:rStyle w:val="a6"/>
@@ -587,7 +587,7 @@
                 <w:noProof/>
                 <w:webHidden/>
               </w:rPr>
-              <w:instrText xml:space="preserve"> PAGEREF _Toc225270436 \h </w:instrText>
+              <w:instrText xml:space="preserve"> PAGEREF _Toc225603945 \h </w:instrText>
             </w:r>
             <w:r>
               <w:rPr>
@@ -631,7 +631,7 @@
               <w:lang w:eastAsia="ru-RU"/>
             </w:rPr>
           </w:pPr>
-          <w:hyperlink w:anchor="_Toc225270437" w:history="1">
+          <w:hyperlink w:anchor="_Toc225603946" w:history="1">
             <w:r>
               <w:rPr>
                 <w:rStyle w:val="a6"/>
@@ -660,7 +660,7 @@
                 <w:noProof/>
                 <w:webHidden/>
               </w:rPr>
-              <w:instrText xml:space="preserve"> PAGEREF _Toc225270437 \h </w:instrText>
+              <w:instrText xml:space="preserve"> PAGEREF _Toc225603946 \h </w:instrText>
             </w:r>
             <w:r>
               <w:rPr>
@@ -704,7 +704,7 @@
               <w:lang w:eastAsia="ru-RU"/>
             </w:rPr>
           </w:pPr>
-          <w:hyperlink w:anchor="_Toc225270438" w:history="1">
+          <w:hyperlink w:anchor="_Toc225603947" w:history="1">
             <w:r>
               <w:rPr>
                 <w:rStyle w:val="a6"/>
@@ -732,7 +732,7 @@
                 <w:noProof/>
                 <w:webHidden/>
               </w:rPr>
-              <w:instrText xml:space="preserve"> PAGEREF _Toc225270438 \h </w:instrText>
+              <w:instrText xml:space="preserve"> PAGEREF _Toc225603947 \h </w:instrText>
             </w:r>
             <w:r>
               <w:rPr>
@@ -773,7 +773,7 @@
               <w:lang w:val="ru-RU" w:eastAsia="ru-RU"/>
             </w:rPr>
           </w:pPr>
-          <w:hyperlink w:anchor="_Toc225270439" w:history="1">
+          <w:hyperlink w:anchor="_Toc225603948" w:history="1">
             <w:r>
               <w:rPr>
                 <w:rStyle w:val="a6"/>
@@ -796,7 +796,7 @@
               <w:rPr>
                 <w:webHidden/>
               </w:rPr>
-              <w:instrText xml:space="preserve"> PAGEREF _Toc225270439 \h </w:instrText>
+              <w:instrText xml:space="preserve"> PAGEREF _Toc225603948 \h </w:instrText>
             </w:r>
             <w:r>
               <w:rPr>
@@ -836,7 +836,7 @@
               <w:lang w:eastAsia="ru-RU"/>
             </w:rPr>
           </w:pPr>
-          <w:hyperlink w:anchor="_Toc225270440" w:history="1">
+          <w:hyperlink w:anchor="_Toc225603949" w:history="1">
             <w:r>
               <w:rPr>
                 <w:rStyle w:val="a6"/>
@@ -864,7 +864,7 @@
                 <w:noProof/>
                 <w:webHidden/>
               </w:rPr>
-              <w:instrText xml:space="preserve"> PAGEREF _Toc225270440 \h </w:instrText>
+              <w:instrText xml:space="preserve"> PAGEREF _Toc225603949 \h </w:instrText>
             </w:r>
             <w:r>
               <w:rPr>
@@ -885,6 +885,213 @@
                 <w:webHidden/>
               </w:rPr>
               <w:t>4</w:t>
+            </w:r>
+            <w:r>
+              <w:rPr>
+                <w:noProof/>
+                <w:webHidden/>
+              </w:rPr>
+              <w:fldChar w:fldCharType="end"/>
+            </w:r>
+          </w:hyperlink>
+        </w:p>
+        <w:p>
+          <w:pPr>
+            <w:pStyle w:val="31"/>
+            <w:tabs>
+              <w:tab w:val="right" w:leader="dot" w:pos="9345"/>
+            </w:tabs>
+            <w:rPr>
+              <w:noProof/>
+            </w:rPr>
+          </w:pPr>
+          <w:hyperlink w:anchor="_Toc225603950" w:history="1">
+            <w:r>
+              <w:rPr>
+                <w:rStyle w:val="a6"/>
+                <w:noProof/>
+                <w:lang w:val="uk-UA" w:eastAsia="ru-RU"/>
+              </w:rPr>
+              <w:t>Теоретичні відомості та огляд методології</w:t>
+            </w:r>
+            <w:r>
+              <w:rPr>
+                <w:noProof/>
+                <w:webHidden/>
+              </w:rPr>
+              <w:tab/>
+            </w:r>
+            <w:r>
+              <w:rPr>
+                <w:noProof/>
+                <w:webHidden/>
+              </w:rPr>
+              <w:fldChar w:fldCharType="begin"/>
+            </w:r>
+            <w:r>
+              <w:rPr>
+                <w:noProof/>
+                <w:webHidden/>
+              </w:rPr>
+              <w:instrText xml:space="preserve"> PAGEREF _Toc225603950 \h </w:instrText>
+            </w:r>
+            <w:r>
+              <w:rPr>
+                <w:noProof/>
+                <w:webHidden/>
+              </w:rPr>
+            </w:r>
+            <w:r>
+              <w:rPr>
+                <w:noProof/>
+                <w:webHidden/>
+              </w:rPr>
+              <w:fldChar w:fldCharType="separate"/>
+            </w:r>
+            <w:r>
+              <w:rPr>
+                <w:noProof/>
+                <w:webHidden/>
+              </w:rPr>
+              <w:t>4</w:t>
+            </w:r>
+            <w:r>
+              <w:rPr>
+                <w:noProof/>
+                <w:webHidden/>
+              </w:rPr>
+              <w:fldChar w:fldCharType="end"/>
+            </w:r>
+          </w:hyperlink>
+        </w:p>
+        <w:p>
+          <w:pPr>
+            <w:pStyle w:val="31"/>
+            <w:tabs>
+              <w:tab w:val="right" w:leader="dot" w:pos="9345"/>
+            </w:tabs>
+            <w:rPr>
+              <w:noProof/>
+            </w:rPr>
+          </w:pPr>
+          <w:hyperlink w:anchor="_Toc225603951" w:history="1">
+            <w:r>
+              <w:rPr>
+                <w:rStyle w:val="a6"/>
+                <w:noProof/>
+                <w:lang w:val="uk-UA" w:eastAsia="ru-RU"/>
+              </w:rPr>
+              <w:t>Адаптація методології до умов проекту</w:t>
+            </w:r>
+            <w:r>
+              <w:rPr>
+                <w:noProof/>
+                <w:webHidden/>
+              </w:rPr>
+              <w:tab/>
+            </w:r>
+            <w:r>
+              <w:rPr>
+                <w:noProof/>
+                <w:webHidden/>
+              </w:rPr>
+              <w:fldChar w:fldCharType="begin"/>
+            </w:r>
+            <w:r>
+              <w:rPr>
+                <w:noProof/>
+                <w:webHidden/>
+              </w:rPr>
+              <w:instrText xml:space="preserve"> PAGEREF _Toc225603951 \h </w:instrText>
+            </w:r>
+            <w:r>
+              <w:rPr>
+                <w:noProof/>
+                <w:webHidden/>
+              </w:rPr>
+            </w:r>
+            <w:r>
+              <w:rPr>
+                <w:noProof/>
+                <w:webHidden/>
+              </w:rPr>
+              <w:fldChar w:fldCharType="separate"/>
+            </w:r>
+            <w:r>
+              <w:rPr>
+                <w:noProof/>
+                <w:webHidden/>
+              </w:rPr>
+              <w:t>4</w:t>
+            </w:r>
+            <w:r>
+              <w:rPr>
+                <w:noProof/>
+                <w:webHidden/>
+              </w:rPr>
+              <w:fldChar w:fldCharType="end"/>
+            </w:r>
+          </w:hyperlink>
+        </w:p>
+        <w:p>
+          <w:pPr>
+            <w:pStyle w:val="31"/>
+            <w:tabs>
+              <w:tab w:val="right" w:leader="dot" w:pos="9345"/>
+            </w:tabs>
+            <w:rPr>
+              <w:noProof/>
+            </w:rPr>
+          </w:pPr>
+          <w:hyperlink w:anchor="_Toc225603952" w:history="1">
+            <w:r>
+              <w:rPr>
+                <w:rStyle w:val="a6"/>
+                <w:noProof/>
+                <w:lang w:val="uk-UA" w:eastAsia="ru-RU"/>
+              </w:rPr>
+              <w:t>Практичне застосування в рамках лабораторної роботи</w:t>
+            </w:r>
+            <w:r>
+              <w:rPr>
+                <w:noProof/>
+                <w:webHidden/>
+              </w:rPr>
+              <w:tab/>
+            </w:r>
+            <w:r>
+              <w:rPr>
+                <w:noProof/>
+                <w:webHidden/>
+              </w:rPr>
+              <w:fldChar w:fldCharType="begin"/>
+            </w:r>
+            <w:r>
+              <w:rPr>
+                <w:noProof/>
+                <w:webHidden/>
+              </w:rPr>
+              <w:instrText xml:space="preserve"> PAGEREF _Toc225603952 \h </w:instrText>
+            </w:r>
+            <w:r>
+              <w:rPr>
+                <w:noProof/>
+                <w:webHidden/>
+              </w:rPr>
+            </w:r>
+            <w:r>
+              <w:rPr>
+                <w:noProof/>
+                <w:webHidden/>
+              </w:rPr>
+              <w:fldChar w:fldCharType="separate"/>
+            </w:r>
+            <w:r>
+              <w:rPr>
+                <w:noProof/>
+                <w:webHidden/>
+              </w:rPr>
+              <w:t>5</w:t>
             </w:r>
             <w:r>
               <w:rPr>
@@ -908,7 +1115,7 @@
               <w:lang w:eastAsia="ru-RU"/>
             </w:rPr>
           </w:pPr>
-          <w:hyperlink w:anchor="_Toc225270441" w:history="1">
+          <w:hyperlink w:anchor="_Toc225603953" w:history="1">
             <w:r>
               <w:rPr>
                 <w:rStyle w:val="a6"/>
@@ -936,7 +1143,7 @@
                 <w:noProof/>
                 <w:webHidden/>
               </w:rPr>
-              <w:instrText xml:space="preserve"> PAGEREF _Toc225270441 \h </w:instrText>
+              <w:instrText xml:space="preserve"> PAGEREF _Toc225603953 \h </w:instrText>
             </w:r>
             <w:r>
               <w:rPr>
@@ -956,7 +1163,7 @@
                 <w:noProof/>
                 <w:webHidden/>
               </w:rPr>
-              <w:t>4</w:t>
+              <w:t>5</w:t>
             </w:r>
             <w:r>
               <w:rPr>
@@ -980,7 +1187,7 @@
               <w:lang w:eastAsia="ru-RU"/>
             </w:rPr>
           </w:pPr>
-          <w:hyperlink w:anchor="_Toc225270442" w:history="1">
+          <w:hyperlink w:anchor="_Toc225603954" w:history="1">
             <w:r>
               <w:rPr>
                 <w:rStyle w:val="a6"/>
@@ -1008,7 +1215,7 @@
                 <w:noProof/>
                 <w:webHidden/>
               </w:rPr>
-              <w:instrText xml:space="preserve"> PAGEREF _Toc225270442 \h </w:instrText>
+              <w:instrText xml:space="preserve"> PAGEREF _Toc225603954 \h </w:instrText>
             </w:r>
             <w:r>
               <w:rPr>
@@ -1028,7 +1235,7 @@
                 <w:noProof/>
                 <w:webHidden/>
               </w:rPr>
-              <w:t>5</w:t>
+              <w:t>6</w:t>
             </w:r>
             <w:r>
               <w:rPr>
@@ -1052,7 +1259,7 @@
               <w:lang w:eastAsia="ru-RU"/>
             </w:rPr>
           </w:pPr>
-          <w:hyperlink w:anchor="_Toc225270443" w:history="1">
+          <w:hyperlink w:anchor="_Toc225603955" w:history="1">
             <w:r>
               <w:rPr>
                 <w:rStyle w:val="a6"/>
@@ -1080,7 +1287,7 @@
                 <w:noProof/>
                 <w:webHidden/>
               </w:rPr>
-              <w:instrText xml:space="preserve"> PAGEREF _Toc225270443 \h </w:instrText>
+              <w:instrText xml:space="preserve"> PAGEREF _Toc225603955 \h </w:instrText>
             </w:r>
             <w:r>
               <w:rPr>
@@ -1100,7 +1307,7 @@
                 <w:noProof/>
                 <w:webHidden/>
               </w:rPr>
-              <w:t>5</w:t>
+              <w:t>6</w:t>
             </w:r>
             <w:r>
               <w:rPr>
@@ -1121,7 +1328,7 @@
               <w:lang w:val="ru-RU" w:eastAsia="ru-RU"/>
             </w:rPr>
           </w:pPr>
-          <w:hyperlink w:anchor="_Toc225270444" w:history="1">
+          <w:hyperlink w:anchor="_Toc225603956" w:history="1">
             <w:r>
               <w:rPr>
                 <w:rStyle w:val="a6"/>
@@ -1144,7 +1351,7 @@
               <w:rPr>
                 <w:webHidden/>
               </w:rPr>
-              <w:instrText xml:space="preserve"> PAGEREF _Toc225270444 \h </w:instrText>
+              <w:instrText xml:space="preserve"> PAGEREF _Toc225603956 \h </w:instrText>
             </w:r>
             <w:r>
               <w:rPr>
@@ -1161,7 +1368,7 @@
               <w:rPr>
                 <w:webHidden/>
               </w:rPr>
-              <w:t>6</w:t>
+              <w:t>7</w:t>
             </w:r>
             <w:r>
               <w:rPr>
@@ -1181,7 +1388,7 @@
               <w:lang w:val="ru-RU" w:eastAsia="ru-RU"/>
             </w:rPr>
           </w:pPr>
-          <w:hyperlink w:anchor="_Toc225270445" w:history="1">
+          <w:hyperlink w:anchor="_Toc225603957" w:history="1">
             <w:r>
               <w:rPr>
                 <w:rStyle w:val="a6"/>
@@ -1204,7 +1411,7 @@
               <w:rPr>
                 <w:webHidden/>
               </w:rPr>
-              <w:instrText xml:space="preserve"> PAGEREF _Toc225270445 \h </w:instrText>
+              <w:instrText xml:space="preserve"> PAGEREF _Toc225603957 \h </w:instrText>
             </w:r>
             <w:r>
               <w:rPr>
@@ -1221,7 +1428,7 @@
               <w:rPr>
                 <w:webHidden/>
               </w:rPr>
-              <w:t>7</w:t>
+              <w:t>8</w:t>
             </w:r>
             <w:r>
               <w:rPr>
@@ -1276,7 +1483,7 @@
           <w:lang w:val="uk-UA"/>
         </w:rPr>
       </w:pPr>
-      <w:bookmarkStart w:id="0" w:name="_Toc225270435"/>
+      <w:bookmarkStart w:id="0" w:name="_Toc225603944"/>
       <w:r>
         <w:rPr>
           <w:rFonts w:cs="Times New Roman"/>
@@ -1297,7 +1504,7 @@
           <w:lang w:val="uk-UA" w:eastAsia="ru-RU"/>
         </w:rPr>
       </w:pPr>
-      <w:bookmarkStart w:id="1" w:name="_Toc225270436"/>
+      <w:bookmarkStart w:id="1" w:name="_Toc225603945"/>
       <w:r>
         <w:rPr>
           <w:rFonts w:cs="Times New Roman"/>
@@ -1337,7 +1544,7 @@
           <w:lang w:val="uk-UA" w:eastAsia="ru-RU"/>
         </w:rPr>
       </w:pPr>
-      <w:bookmarkStart w:id="2" w:name="_Toc225270437"/>
+      <w:bookmarkStart w:id="2" w:name="_Toc225603946"/>
       <w:r>
         <w:rPr>
           <w:rFonts w:eastAsiaTheme="minorHAnsi" w:cs="Times New Roman"/>
@@ -1585,12 +1792,48 @@
     </w:p>
     <w:p>
       <w:pPr>
+        <w:pStyle w:val="ab"/>
+        <w:numPr>
+          <w:ilvl w:val="0"/>
+          <w:numId w:val="5"/>
+        </w:numPr>
+        <w:rPr>
+          <w:lang w:val="uk-UA" w:eastAsia="ru-RU"/>
+        </w:rPr>
+      </w:pPr>
+      <w:r>
+        <w:rPr>
+          <w:lang w:val="uk-UA" w:eastAsia="ru-RU"/>
+        </w:rPr>
+        <w:t xml:space="preserve">Кількість кадрів в секунду </w:t>
+      </w:r>
+      <w:r>
+        <w:rPr>
+          <w:lang w:eastAsia="ru-RU"/>
+        </w:rPr>
+        <w:t>(</w:t>
+      </w:r>
+      <w:r>
+        <w:rPr>
+          <w:lang w:val="en-US" w:eastAsia="ru-RU"/>
+        </w:rPr>
+        <w:t>FPS</w:t>
+      </w:r>
+      <w:r>
+        <w:rPr>
+          <w:lang w:val="uk-UA" w:eastAsia="ru-RU"/>
+        </w:rPr>
+        <w:t>) для анімації</w:t>
+      </w:r>
+    </w:p>
+    <w:p>
+      <w:pPr>
         <w:pStyle w:val="2"/>
         <w:rPr>
           <w:lang w:val="uk-UA"/>
         </w:rPr>
       </w:pPr>
-      <w:bookmarkStart w:id="3" w:name="_Toc225270438"/>
+      <w:bookmarkStart w:id="3" w:name="_Toc225603947"/>
       <w:r>
         <w:rPr>
           <w:lang w:val="uk-UA"/>
@@ -1897,7 +2140,7 @@
           <w:lang w:val="uk-UA"/>
         </w:rPr>
       </w:pPr>
-      <w:bookmarkStart w:id="4" w:name="_Toc225270439"/>
+      <w:bookmarkStart w:id="4" w:name="_Toc225603948"/>
       <w:r>
         <w:rPr>
           <w:lang w:val="uk-UA"/>
@@ -1914,7 +2157,7 @@
           <w:lang w:val="uk-UA"/>
         </w:rPr>
       </w:pPr>
-      <w:bookmarkStart w:id="5" w:name="_Toc225270440"/>
+      <w:bookmarkStart w:id="5" w:name="_Toc225603949"/>
       <w:r>
         <w:rPr>
           <w:lang w:val="uk-UA"/>
@@ -1925,6 +2168,24 @@
     </w:p>
     <w:p>
       <w:pPr>
+        <w:pStyle w:val="3"/>
+        <w:rPr>
+          <w:rFonts w:eastAsiaTheme="minorHAnsi"/>
+          <w:lang w:val="uk-UA" w:eastAsia="ru-RU"/>
+        </w:rPr>
+      </w:pPr>
+      <w:bookmarkStart w:id="6" w:name="_Toc225603950"/>
+      <w:r>
+        <w:rPr>
+          <w:rFonts w:eastAsiaTheme="minorHAnsi"/>
+          <w:lang w:val="uk-UA" w:eastAsia="ru-RU"/>
+        </w:rPr>
+        <w:t>Теоретичні відомості та огляд методології</w:t>
+      </w:r>
+      <w:bookmarkEnd w:id="6"/>
+    </w:p>
+    <w:p>
+      <w:pPr>
         <w:ind w:firstLine="708"/>
         <w:rPr>
           <w:lang w:val="uk-UA" w:eastAsia="ru-RU"/>
@@ -1934,129 +2195,181 @@
         <w:rPr>
           <w:lang w:val="uk-UA" w:eastAsia="ru-RU"/>
         </w:rPr>
-        <w:t xml:space="preserve">В якості основи для виконання цієї лабораторної роботи було обрано методологію </w:t>
-      </w:r>
-      <w:r>
-        <w:rPr>
-          <w:lang w:val="uk-UA" w:eastAsia="ru-RU"/>
-        </w:rPr>
-        <w:t>«</w:t>
-      </w:r>
-      <w:r>
-        <w:rPr>
-          <w:lang w:val="uk-UA" w:eastAsia="ru-RU"/>
-        </w:rPr>
-        <w:t>Екстремального програ</w:t>
-      </w:r>
-      <w:r>
-        <w:rPr>
-          <w:lang w:val="uk-UA" w:eastAsia="ru-RU"/>
-        </w:rPr>
-        <w:t>мування</w:t>
-      </w:r>
-      <w:r>
-        <w:rPr>
-          <w:lang w:val="uk-UA" w:eastAsia="ru-RU"/>
-        </w:rPr>
-        <w:t>»</w:t>
-      </w:r>
-      <w:r>
-        <w:rPr>
-          <w:lang w:val="uk-UA" w:eastAsia="ru-RU"/>
-        </w:rPr>
-        <w:t xml:space="preserve"> (</w:t>
+        <w:t>В якості основи для виконання цієї лабораторної роботи було обрано методологію Екстремального програмування (</w:t>
+      </w:r>
+      <w:proofErr w:type="spellStart"/>
+      <w:r>
+        <w:rPr>
+          <w:lang w:val="uk-UA" w:eastAsia="ru-RU"/>
+        </w:rPr>
+        <w:t>Extreme</w:t>
+      </w:r>
+      <w:proofErr w:type="spellEnd"/>
+      <w:r>
+        <w:rPr>
+          <w:lang w:val="uk-UA" w:eastAsia="ru-RU"/>
+        </w:rPr>
+        <w:t xml:space="preserve"> </w:t>
+      </w:r>
+      <w:proofErr w:type="spellStart"/>
+      <w:r>
+        <w:rPr>
+          <w:lang w:val="uk-UA" w:eastAsia="ru-RU"/>
+        </w:rPr>
+        <w:t>Programming</w:t>
+      </w:r>
+      <w:proofErr w:type="spellEnd"/>
+      <w:r>
+        <w:rPr>
+          <w:lang w:val="uk-UA" w:eastAsia="ru-RU"/>
+        </w:rPr>
+        <w:t xml:space="preserve">, </w:t>
+      </w:r>
+      <w:r>
+        <w:rPr>
+          <w:lang w:val="uk-UA" w:eastAsia="ru-RU"/>
+        </w:rPr>
+        <w:t xml:space="preserve">далі - </w:t>
+      </w:r>
+      <w:r>
+        <w:rPr>
+          <w:lang w:val="uk-UA" w:eastAsia="ru-RU"/>
+        </w:rPr>
+        <w:t xml:space="preserve">XP), яка є одним із найвідоміших та </w:t>
+      </w:r>
+      <w:proofErr w:type="spellStart"/>
+      <w:r>
+        <w:rPr>
+          <w:lang w:val="uk-UA" w:eastAsia="ru-RU"/>
+        </w:rPr>
+        <w:t>найтехнічніших</w:t>
+      </w:r>
+      <w:proofErr w:type="spellEnd"/>
+      <w:r>
+        <w:rPr>
+          <w:lang w:val="uk-UA" w:eastAsia="ru-RU"/>
+        </w:rPr>
+        <w:t xml:space="preserve"> </w:t>
+      </w:r>
+      <w:proofErr w:type="spellStart"/>
+      <w:r>
+        <w:rPr>
+          <w:lang w:val="uk-UA" w:eastAsia="ru-RU"/>
+        </w:rPr>
+        <w:t>відгалужень</w:t>
+      </w:r>
+      <w:proofErr w:type="spellEnd"/>
+      <w:r>
+        <w:rPr>
+          <w:lang w:val="uk-UA" w:eastAsia="ru-RU"/>
+        </w:rPr>
+        <w:t xml:space="preserve"> гнучкого підходу (</w:t>
+      </w:r>
+      <w:proofErr w:type="spellStart"/>
+      <w:r>
+        <w:rPr>
+          <w:lang w:val="uk-UA" w:eastAsia="ru-RU"/>
+        </w:rPr>
+        <w:t>Agile</w:t>
+      </w:r>
+      <w:proofErr w:type="spellEnd"/>
+      <w:r>
+        <w:rPr>
+          <w:lang w:val="uk-UA" w:eastAsia="ru-RU"/>
+        </w:rPr>
+        <w:t>).</w:t>
+      </w:r>
+    </w:p>
+    <w:p>
+      <w:pPr>
+        <w:ind w:firstLine="708"/>
+        <w:rPr>
+          <w:lang w:val="uk-UA" w:eastAsia="ru-RU"/>
+        </w:rPr>
+      </w:pPr>
+      <w:r>
+        <w:rPr>
+          <w:lang w:val="uk-UA" w:eastAsia="ru-RU"/>
+        </w:rPr>
+        <w:t xml:space="preserve">Історично методологія XP була створена для розробки програмного забезпечення в умовах високої невизначеності, де вимоги замовника можуть </w:t>
+      </w:r>
+      <w:proofErr w:type="spellStart"/>
+      <w:r>
+        <w:rPr>
+          <w:lang w:val="uk-UA" w:eastAsia="ru-RU"/>
+        </w:rPr>
+        <w:t>динамічно</w:t>
+      </w:r>
+      <w:proofErr w:type="spellEnd"/>
+      <w:r>
+        <w:rPr>
+          <w:lang w:val="uk-UA" w:eastAsia="ru-RU"/>
+        </w:rPr>
+        <w:t xml:space="preserve"> і кардинально змін</w:t>
+      </w:r>
+      <w:r>
+        <w:rPr>
+          <w:lang w:val="uk-UA" w:eastAsia="ru-RU"/>
+        </w:rPr>
+        <w:t>юватися на будь-якому етапі прое</w:t>
+      </w:r>
+      <w:r>
+        <w:rPr>
+          <w:lang w:val="uk-UA" w:eastAsia="ru-RU"/>
+        </w:rPr>
+        <w:t xml:space="preserve">кту. Головна </w:t>
+      </w:r>
+      <w:r>
+        <w:rPr>
+          <w:lang w:val="uk-UA" w:eastAsia="ru-RU"/>
+        </w:rPr>
+        <w:t>ідея XP полягає у зниженні «вартості змін»</w:t>
+      </w:r>
+      <w:r>
+        <w:rPr>
+          <w:lang w:val="uk-UA" w:eastAsia="ru-RU"/>
+        </w:rPr>
+        <w:t>. Якщо традиційні каскадні моделі (</w:t>
+      </w:r>
+      <w:r>
+        <w:rPr>
+          <w:lang w:val="uk-UA" w:eastAsia="ru-RU"/>
+        </w:rPr>
+        <w:t xml:space="preserve">до прикладу – </w:t>
       </w:r>
       <w:r>
         <w:rPr>
           <w:lang w:val="en-US" w:eastAsia="ru-RU"/>
         </w:rPr>
-        <w:t xml:space="preserve">AKA </w:t>
-      </w:r>
-      <w:r>
-        <w:rPr>
-          <w:lang w:val="uk-UA" w:eastAsia="ru-RU"/>
-        </w:rPr>
-        <w:t>«</w:t>
+        <w:t>W</w:t>
       </w:r>
       <w:proofErr w:type="spellStart"/>
       <w:r>
         <w:rPr>
           <w:lang w:val="uk-UA" w:eastAsia="ru-RU"/>
         </w:rPr>
-        <w:t>Extreme</w:t>
+        <w:t>aterfall</w:t>
       </w:r>
       <w:proofErr w:type="spellEnd"/>
       <w:r>
         <w:rPr>
           <w:lang w:val="uk-UA" w:eastAsia="ru-RU"/>
         </w:rPr>
-        <w:t xml:space="preserve"> </w:t>
+        <w:t xml:space="preserve">) роблять внесення змін на пізніх етапах надзвичайно дорогим та ризикованим, то XP прагне зробити код настільки гнучким, щоб нова архітектура чи </w:t>
       </w:r>
       <w:proofErr w:type="spellStart"/>
       <w:r>
         <w:rPr>
           <w:lang w:val="uk-UA" w:eastAsia="ru-RU"/>
         </w:rPr>
-        <w:t>Programming</w:t>
+        <w:t>фіча</w:t>
       </w:r>
       <w:proofErr w:type="spellEnd"/>
       <w:r>
         <w:rPr>
           <w:lang w:val="uk-UA" w:eastAsia="ru-RU"/>
         </w:rPr>
-        <w:t xml:space="preserve">», далі - </w:t>
-      </w:r>
-      <w:r>
-        <w:rPr>
-          <w:lang w:val="en-US" w:eastAsia="ru-RU"/>
-        </w:rPr>
-        <w:t>XP</w:t>
-      </w:r>
-      <w:r>
-        <w:rPr>
-          <w:lang w:val="uk-UA" w:eastAsia="ru-RU"/>
-        </w:rPr>
-        <w:t xml:space="preserve">), яка </w:t>
-      </w:r>
-      <w:r>
-        <w:rPr>
-          <w:lang w:val="uk-UA" w:eastAsia="ru-RU"/>
-        </w:rPr>
-        <w:t xml:space="preserve">фактично є підпунктом підходу </w:t>
-      </w:r>
-      <w:proofErr w:type="spellStart"/>
-      <w:r>
-        <w:rPr>
-          <w:lang w:val="uk-UA" w:eastAsia="ru-RU"/>
-        </w:rPr>
-        <w:t>Agile</w:t>
-      </w:r>
-      <w:proofErr w:type="spellEnd"/>
-      <w:r>
-        <w:rPr>
-          <w:lang w:eastAsia="ru-RU"/>
-        </w:rPr>
-        <w:t xml:space="preserve"> (</w:t>
-      </w:r>
-      <w:proofErr w:type="spellStart"/>
-      <w:r>
-        <w:rPr>
-          <w:lang w:val="uk-UA" w:eastAsia="ru-RU"/>
-        </w:rPr>
-        <w:t>гибкого</w:t>
-      </w:r>
-      <w:proofErr w:type="spellEnd"/>
-      <w:r>
-        <w:rPr>
-          <w:lang w:val="uk-UA" w:eastAsia="ru-RU"/>
-        </w:rPr>
-        <w:t xml:space="preserve"> підходу)</w:t>
-      </w:r>
-      <w:r>
-        <w:rPr>
-          <w:lang w:val="uk-UA" w:eastAsia="ru-RU"/>
-        </w:rPr>
-        <w:t>.</w:t>
+        <w:t xml:space="preserve"> могла бути інтегрована без руйнування існуючої системи.</w:t>
       </w:r>
     </w:p>
     <w:p>
@@ -2070,210 +2383,7 @@
         <w:rPr>
           <w:lang w:val="uk-UA" w:eastAsia="ru-RU"/>
         </w:rPr>
-        <w:t>У своєму класичному вигляді XP являє собою комплексну методологію, яка включає такі практики, як парне програмування, розробка через тестування, часті релізи та щод</w:t>
-      </w:r>
-      <w:r>
-        <w:rPr>
-          <w:lang w:val="uk-UA" w:eastAsia="ru-RU"/>
-        </w:rPr>
-        <w:t>енна комунікація із замовником.</w:t>
-      </w:r>
-    </w:p>
-    <w:p>
-      <w:pPr>
-        <w:ind w:firstLine="708"/>
-        <w:rPr>
-          <w:lang w:val="uk-UA" w:eastAsia="ru-RU"/>
-        </w:rPr>
-      </w:pPr>
-      <w:r>
-        <w:rPr>
-          <w:b/>
-          <w:i/>
-          <w:lang w:val="uk-UA" w:eastAsia="ru-RU"/>
-        </w:rPr>
-        <w:t>ОДНАК</w:t>
-      </w:r>
-      <w:r>
-        <w:rPr>
-          <w:b/>
-          <w:i/>
-          <w:lang w:val="uk-UA" w:eastAsia="ru-RU"/>
-        </w:rPr>
-        <w:t>!!</w:t>
-      </w:r>
-      <w:r>
-        <w:rPr>
-          <w:b/>
-          <w:i/>
-          <w:lang w:val="uk-UA" w:eastAsia="ru-RU"/>
-        </w:rPr>
-        <w:t>!</w:t>
-      </w:r>
-      <w:r>
-        <w:rPr>
-          <w:lang w:val="uk-UA" w:eastAsia="ru-RU"/>
-        </w:rPr>
-        <w:t xml:space="preserve"> У рамках даної лабораторної роботи </w:t>
-      </w:r>
-      <w:r>
-        <w:rPr>
-          <w:i/>
-          <w:lang w:val="uk-UA" w:eastAsia="ru-RU"/>
-        </w:rPr>
-        <w:t>я не буду</w:t>
-      </w:r>
-      <w:r>
-        <w:rPr>
-          <w:lang w:val="uk-UA" w:eastAsia="ru-RU"/>
-        </w:rPr>
-        <w:t xml:space="preserve"> використовувати весь цей спектр інструментів, оскільки </w:t>
-      </w:r>
-      <w:r>
-        <w:rPr>
-          <w:lang w:val="uk-UA" w:eastAsia="ru-RU"/>
-        </w:rPr>
-        <w:t xml:space="preserve">наразі </w:t>
-      </w:r>
-      <w:r>
-        <w:rPr>
-          <w:lang w:val="uk-UA" w:eastAsia="ru-RU"/>
-        </w:rPr>
-        <w:t xml:space="preserve">для моєї задачі </w:t>
-      </w:r>
-      <w:r>
-        <w:rPr>
-          <w:lang w:val="uk-UA" w:eastAsia="ru-RU"/>
-        </w:rPr>
-        <w:t xml:space="preserve">вони є надлишковими. Замість цього </w:t>
-      </w:r>
-      <w:r>
-        <w:rPr>
-          <w:lang w:val="uk-UA" w:eastAsia="ru-RU"/>
-        </w:rPr>
-        <w:t>я запозичу</w:t>
-      </w:r>
-      <w:r>
-        <w:rPr>
-          <w:lang w:val="uk-UA" w:eastAsia="ru-RU"/>
-        </w:rPr>
-        <w:t xml:space="preserve"> з XP лише одну, але найбіль</w:t>
-      </w:r>
-      <w:r>
-        <w:rPr>
-          <w:lang w:val="uk-UA" w:eastAsia="ru-RU"/>
-        </w:rPr>
-        <w:t xml:space="preserve">ш релевантну для мене практику – </w:t>
-      </w:r>
-      <w:r>
-        <w:rPr>
-          <w:lang w:val="uk-UA" w:eastAsia="ru-RU"/>
-        </w:rPr>
-        <w:t xml:space="preserve">безперервний </w:t>
-      </w:r>
-      <w:proofErr w:type="spellStart"/>
-      <w:r>
-        <w:rPr>
-          <w:lang w:val="uk-UA" w:eastAsia="ru-RU"/>
-        </w:rPr>
-        <w:t>рефакт</w:t>
-      </w:r>
-      <w:r>
-        <w:rPr>
-          <w:lang w:val="uk-UA" w:eastAsia="ru-RU"/>
-        </w:rPr>
-        <w:t>оринг</w:t>
-      </w:r>
-      <w:proofErr w:type="spellEnd"/>
-      <w:r>
-        <w:rPr>
-          <w:lang w:val="uk-UA" w:eastAsia="ru-RU"/>
-        </w:rPr>
-        <w:t>.</w:t>
-      </w:r>
-    </w:p>
-    <w:p>
-      <w:pPr>
-        <w:ind w:firstLine="708"/>
-        <w:rPr>
-          <w:lang w:val="uk-UA" w:eastAsia="ru-RU"/>
-        </w:rPr>
-      </w:pPr>
-      <w:r>
-        <w:rPr>
-          <w:lang w:val="uk-UA" w:eastAsia="ru-RU"/>
-        </w:rPr>
-        <w:t>Оскільки розробка ведеться не з нуля, а на основі вже</w:t>
-      </w:r>
-      <w:r>
-        <w:rPr>
-          <w:lang w:val="uk-UA" w:eastAsia="ru-RU"/>
-        </w:rPr>
-        <w:t xml:space="preserve"> існуючої роботи</w:t>
-      </w:r>
-      <w:r>
-        <w:rPr>
-          <w:lang w:val="uk-UA" w:eastAsia="ru-RU"/>
-        </w:rPr>
-        <w:t>, саме ця модель дозволяє офіційно та безпечно змінювати архітектуру програми стільки разів, скільки потрі</w:t>
-      </w:r>
-      <w:r>
-        <w:rPr>
-          <w:lang w:val="uk-UA" w:eastAsia="ru-RU"/>
-        </w:rPr>
-        <w:t xml:space="preserve">бно для впровадження нових </w:t>
-      </w:r>
-      <w:proofErr w:type="spellStart"/>
-      <w:r>
-        <w:rPr>
-          <w:lang w:val="uk-UA" w:eastAsia="ru-RU"/>
-        </w:rPr>
-        <w:t>фіч</w:t>
-      </w:r>
-      <w:proofErr w:type="spellEnd"/>
-      <w:r>
-        <w:rPr>
-          <w:lang w:val="uk-UA" w:eastAsia="ru-RU"/>
-        </w:rPr>
-        <w:t>.</w:t>
-      </w:r>
-    </w:p>
-    <w:p>
-      <w:pPr>
-        <w:ind w:firstLine="708"/>
-        <w:rPr>
-          <w:lang w:val="uk-UA" w:eastAsia="ru-RU"/>
-        </w:rPr>
-      </w:pPr>
-      <w:r>
-        <w:rPr>
-          <w:lang w:val="uk-UA" w:eastAsia="ru-RU"/>
-        </w:rPr>
-        <w:t>Завдяки</w:t>
-      </w:r>
-      <w:r>
-        <w:rPr>
-          <w:lang w:val="uk-UA" w:eastAsia="ru-RU"/>
-        </w:rPr>
-        <w:t xml:space="preserve"> цьому</w:t>
-      </w:r>
-      <w:r>
-        <w:rPr>
-          <w:lang w:val="uk-UA" w:eastAsia="ru-RU"/>
-        </w:rPr>
-        <w:t>, процес роз</w:t>
-      </w:r>
-      <w:r>
-        <w:rPr>
-          <w:lang w:val="uk-UA" w:eastAsia="ru-RU"/>
-        </w:rPr>
-        <w:t xml:space="preserve">робки </w:t>
-      </w:r>
-      <w:r>
-        <w:rPr>
-          <w:lang w:val="uk-UA" w:eastAsia="ru-RU"/>
-        </w:rPr>
-        <w:t>буде виглядати наступним чином:</w:t>
+        <w:t>У комерційній розробці XP традиційно використовується у невеликих або середніх командах і базується на низці суворих інженерних практик:</w:t>
       </w:r>
     </w:p>
     <w:p>
@@ -2291,13 +2401,59 @@
         <w:rPr>
           <w:lang w:val="uk-UA" w:eastAsia="ru-RU"/>
         </w:rPr>
-        <w:t>А</w:t>
-      </w:r>
-      <w:r>
-        <w:rPr>
-          <w:lang w:val="uk-UA" w:eastAsia="ru-RU"/>
-        </w:rPr>
-        <w:t>наліз недоліків старої системи.</w:t>
+        <w:t>Розробка через тестування (</w:t>
+      </w:r>
+      <w:proofErr w:type="spellStart"/>
+      <w:r>
+        <w:rPr>
+          <w:lang w:val="uk-UA" w:eastAsia="ru-RU"/>
+        </w:rPr>
+        <w:t>Test-Driven</w:t>
+      </w:r>
+      <w:proofErr w:type="spellEnd"/>
+      <w:r>
+        <w:rPr>
+          <w:lang w:val="uk-UA" w:eastAsia="ru-RU"/>
+        </w:rPr>
+        <w:t xml:space="preserve"> </w:t>
+      </w:r>
+      <w:proofErr w:type="spellStart"/>
+      <w:r>
+        <w:rPr>
+          <w:lang w:val="uk-UA" w:eastAsia="ru-RU"/>
+        </w:rPr>
+        <w:t>Development</w:t>
+      </w:r>
+      <w:proofErr w:type="spellEnd"/>
+      <w:r>
+        <w:rPr>
+          <w:lang w:val="en-US" w:eastAsia="ru-RU"/>
+        </w:rPr>
+        <w:t xml:space="preserve">, AKA </w:t>
+      </w:r>
+      <w:r>
+        <w:rPr>
+          <w:lang w:val="uk-UA" w:eastAsia="ru-RU"/>
+        </w:rPr>
+        <w:t>«</w:t>
+      </w:r>
+      <w:r>
+        <w:rPr>
+          <w:lang w:val="uk-UA" w:eastAsia="ru-RU"/>
+        </w:rPr>
+        <w:t>TDD</w:t>
+      </w:r>
+      <w:r>
+        <w:rPr>
+          <w:lang w:val="uk-UA" w:eastAsia="ru-RU"/>
+        </w:rPr>
+        <w:t>»</w:t>
+      </w:r>
+      <w:r>
+        <w:rPr>
+          <w:lang w:val="uk-UA" w:eastAsia="ru-RU"/>
+        </w:rPr>
+        <w:t>): Написання тестів до написання самого коду.</w:t>
       </w:r>
     </w:p>
     <w:p>
@@ -2311,43 +2467,25 @@
           <w:lang w:val="uk-UA" w:eastAsia="ru-RU"/>
         </w:rPr>
       </w:pPr>
+      <w:r>
+        <w:rPr>
+          <w:lang w:val="uk-UA" w:eastAsia="ru-RU"/>
+        </w:rPr>
+        <w:t>Парне програмування: Написання коду двома розробниками за одним комп'ютером для миттєвого код-</w:t>
+      </w:r>
       <w:proofErr w:type="spellStart"/>
       <w:r>
         <w:rPr>
           <w:lang w:val="uk-UA" w:eastAsia="ru-RU"/>
         </w:rPr>
-        <w:t>Рефакторинг</w:t>
+        <w:t>рев'ю</w:t>
       </w:r>
       <w:proofErr w:type="spellEnd"/>
       <w:r>
         <w:rPr>
-          <w:lang w:eastAsia="ru-RU"/>
-        </w:rPr>
-        <w:t xml:space="preserve"> </w:t>
-      </w:r>
-      <w:r>
-        <w:rPr>
-          <w:lang w:val="en-US" w:eastAsia="ru-RU"/>
-        </w:rPr>
-        <w:t>mathModule.py</w:t>
-      </w:r>
-      <w:r>
-        <w:rPr>
-          <w:lang w:val="uk-UA" w:eastAsia="ru-RU"/>
-        </w:rPr>
-        <w:t xml:space="preserve"> (зміна формул та</w:t>
-      </w:r>
-      <w:r>
-        <w:rPr>
-          <w:lang w:val="uk-UA" w:eastAsia="ru-RU"/>
-        </w:rPr>
-        <w:t xml:space="preserve"> даних, які будуть віддаватися у інтерфейс</w:t>
-      </w:r>
-      <w:r>
-        <w:rPr>
-          <w:lang w:val="uk-UA" w:eastAsia="ru-RU"/>
-        </w:rPr>
-        <w:t>)</w:t>
+          <w:lang w:val="uk-UA" w:eastAsia="ru-RU"/>
+        </w:rPr>
+        <w:t>.</w:t>
       </w:r>
     </w:p>
     <w:p>
@@ -2365,51 +2503,506 @@
         <w:rPr>
           <w:lang w:val="uk-UA" w:eastAsia="ru-RU"/>
         </w:rPr>
-        <w:t xml:space="preserve">Впровадження нового функціоналу (система </w:t>
+        <w:t>Коротка ітерація та часті релізи: Постачання робочого продукту замовнику кожні кілька тижнів.</w:t>
+      </w:r>
+    </w:p>
+    <w:p>
+      <w:pPr>
+        <w:pStyle w:val="ab"/>
+        <w:numPr>
+          <w:ilvl w:val="0"/>
+          <w:numId w:val="2"/>
+        </w:numPr>
+        <w:rPr>
+          <w:lang w:val="uk-UA" w:eastAsia="ru-RU"/>
+        </w:rPr>
+      </w:pPr>
+      <w:r>
+        <w:rPr>
+          <w:lang w:val="uk-UA" w:eastAsia="ru-RU"/>
+        </w:rPr>
+        <w:t xml:space="preserve">Безперервний </w:t>
       </w:r>
       <w:proofErr w:type="spellStart"/>
       <w:r>
         <w:rPr>
           <w:lang w:val="uk-UA" w:eastAsia="ru-RU"/>
         </w:rPr>
-        <w:t>валідації</w:t>
+        <w:t>рефакторинг</w:t>
       </w:r>
       <w:proofErr w:type="spellEnd"/>
       <w:r>
         <w:rPr>
           <w:lang w:val="uk-UA" w:eastAsia="ru-RU"/>
         </w:rPr>
-        <w:t>, інформаційні панелі, тощо</w:t>
-      </w:r>
-      <w:r>
-        <w:rPr>
-          <w:lang w:val="uk-UA" w:eastAsia="ru-RU"/>
-        </w:rPr>
-        <w:t xml:space="preserve">) на вже оновлений </w:t>
-      </w:r>
-      <w:r>
-        <w:rPr>
-          <w:lang w:val="uk-UA" w:eastAsia="ru-RU"/>
-        </w:rPr>
-        <w:t>«</w:t>
-      </w:r>
-      <w:r>
-        <w:rPr>
-          <w:lang w:val="uk-UA" w:eastAsia="ru-RU"/>
-        </w:rPr>
-        <w:t>фундамент</w:t>
-      </w:r>
-      <w:r>
-        <w:rPr>
-          <w:lang w:val="uk-UA" w:eastAsia="ru-RU"/>
-        </w:rPr>
-        <w:t>»</w:t>
-      </w:r>
-      <w:r>
-        <w:rPr>
-          <w:lang w:val="uk-UA" w:eastAsia="ru-RU"/>
-        </w:rPr>
-        <w:t xml:space="preserve"> програми.</w:t>
+        <w:t>: Постійне покращення внутрі</w:t>
+      </w:r>
+      <w:r>
+        <w:rPr>
+          <w:lang w:val="uk-UA" w:eastAsia="ru-RU"/>
+        </w:rPr>
+        <w:t>шньої структури коду, усунення «технічного боргу»</w:t>
+      </w:r>
+      <w:r>
+        <w:rPr>
+          <w:lang w:val="uk-UA" w:eastAsia="ru-RU"/>
+        </w:rPr>
+        <w:t xml:space="preserve"> та оптимізація алгоритмів без зміни зовнішньої поведінки програми.</w:t>
+      </w:r>
+    </w:p>
+    <w:p>
+      <w:pPr>
+        <w:pStyle w:val="3"/>
+        <w:rPr>
+          <w:lang w:val="uk-UA" w:eastAsia="ru-RU"/>
+        </w:rPr>
+      </w:pPr>
+      <w:bookmarkStart w:id="7" w:name="_Toc225603951"/>
+      <w:r>
+        <w:rPr>
+          <w:lang w:val="uk-UA" w:eastAsia="ru-RU"/>
+        </w:rPr>
+        <w:t>Адаптаці</w:t>
+      </w:r>
+      <w:r>
+        <w:rPr>
+          <w:lang w:val="uk-UA" w:eastAsia="ru-RU"/>
+        </w:rPr>
+        <w:t>я методології до умов прое</w:t>
+      </w:r>
+      <w:r>
+        <w:rPr>
+          <w:lang w:val="uk-UA" w:eastAsia="ru-RU"/>
+        </w:rPr>
+        <w:t>кту</w:t>
+      </w:r>
+      <w:bookmarkEnd w:id="7"/>
+    </w:p>
+    <w:p>
+      <w:pPr>
+        <w:ind w:firstLine="708"/>
+        <w:rPr>
+          <w:lang w:val="uk-UA" w:eastAsia="ru-RU"/>
+        </w:rPr>
+      </w:pPr>
+      <w:r>
+        <w:rPr>
+          <w:lang w:val="uk-UA" w:eastAsia="ru-RU"/>
+        </w:rPr>
+        <w:t>У своєму класичному вигляді XP являє собою комплексну командну методологію. З огляду на специ</w:t>
+      </w:r>
+      <w:r>
+        <w:rPr>
+          <w:lang w:val="uk-UA" w:eastAsia="ru-RU"/>
+        </w:rPr>
+        <w:t>фіку даної лабораторної роботи</w:t>
+      </w:r>
+      <w:r>
+        <w:rPr>
+          <w:lang w:val="uk-UA" w:eastAsia="ru-RU"/>
+        </w:rPr>
+        <w:t xml:space="preserve">, застосування </w:t>
+      </w:r>
+      <w:r>
+        <w:rPr>
+          <w:lang w:val="uk-UA" w:eastAsia="ru-RU"/>
+        </w:rPr>
+        <w:lastRenderedPageBreak/>
+        <w:t>всього спектру інструментів XP (наприклад, парного програмування чи щоденних мітингів із замовн</w:t>
+      </w:r>
+      <w:r>
+        <w:rPr>
+          <w:lang w:val="uk-UA" w:eastAsia="ru-RU"/>
+        </w:rPr>
+        <w:t>иком) є об'єктивно надлишковим.</w:t>
+      </w:r>
+    </w:p>
+    <w:p>
+      <w:pPr>
+        <w:ind w:firstLine="708"/>
+        <w:rPr>
+          <w:lang w:val="uk-UA" w:eastAsia="ru-RU"/>
+        </w:rPr>
+      </w:pPr>
+      <w:r>
+        <w:rPr>
+          <w:lang w:val="uk-UA" w:eastAsia="ru-RU"/>
+        </w:rPr>
+        <w:t>ТОМУ з</w:t>
+      </w:r>
+      <w:r>
+        <w:rPr>
+          <w:lang w:val="uk-UA" w:eastAsia="ru-RU"/>
+        </w:rPr>
+        <w:t>амість сліпого коп</w:t>
+      </w:r>
+      <w:r>
+        <w:rPr>
+          <w:lang w:val="uk-UA" w:eastAsia="ru-RU"/>
+        </w:rPr>
+        <w:t xml:space="preserve">іювання </w:t>
+      </w:r>
+      <w:proofErr w:type="spellStart"/>
+      <w:r>
+        <w:rPr>
+          <w:lang w:val="uk-UA" w:eastAsia="ru-RU"/>
+        </w:rPr>
+        <w:t>фреймворку</w:t>
+      </w:r>
+      <w:proofErr w:type="spellEnd"/>
+      <w:r>
+        <w:rPr>
+          <w:lang w:val="uk-UA" w:eastAsia="ru-RU"/>
+        </w:rPr>
+        <w:t>, у цьому прое</w:t>
+      </w:r>
+      <w:r>
+        <w:rPr>
+          <w:lang w:val="uk-UA" w:eastAsia="ru-RU"/>
+        </w:rPr>
+        <w:t>кті застосовується</w:t>
+      </w:r>
+      <w:r>
+        <w:rPr>
+          <w:lang w:val="uk-UA" w:eastAsia="ru-RU"/>
+        </w:rPr>
+        <w:t xml:space="preserve"> більш простий</w:t>
+      </w:r>
+      <w:r>
+        <w:rPr>
+          <w:lang w:val="uk-UA" w:eastAsia="ru-RU"/>
+        </w:rPr>
+        <w:t xml:space="preserve"> підхід: з XP запозичується лише одна, але найбільш </w:t>
+      </w:r>
+      <w:r>
+        <w:rPr>
+          <w:lang w:val="uk-UA" w:eastAsia="ru-RU"/>
+        </w:rPr>
+        <w:t xml:space="preserve">логічна </w:t>
+      </w:r>
+      <w:r>
+        <w:rPr>
+          <w:lang w:val="uk-UA" w:eastAsia="ru-RU"/>
+        </w:rPr>
+        <w:t>для поточн</w:t>
+      </w:r>
+      <w:r>
+        <w:rPr>
+          <w:lang w:val="uk-UA" w:eastAsia="ru-RU"/>
+        </w:rPr>
+        <w:t>ої задачі практика –</w:t>
+      </w:r>
+      <w:r>
+        <w:rPr>
+          <w:lang w:val="uk-UA" w:eastAsia="ru-RU"/>
+        </w:rPr>
+        <w:t xml:space="preserve"> безперервний </w:t>
+      </w:r>
+      <w:proofErr w:type="spellStart"/>
+      <w:r>
+        <w:rPr>
+          <w:lang w:val="uk-UA" w:eastAsia="ru-RU"/>
+        </w:rPr>
+        <w:t>рефакторинг</w:t>
+      </w:r>
+      <w:proofErr w:type="spellEnd"/>
+      <w:r>
+        <w:rPr>
+          <w:lang w:val="uk-UA" w:eastAsia="ru-RU"/>
+        </w:rPr>
+        <w:t>.</w:t>
+      </w:r>
+    </w:p>
+    <w:p>
+      <w:pPr>
+        <w:pStyle w:val="3"/>
+        <w:rPr>
+          <w:lang w:val="uk-UA" w:eastAsia="ru-RU"/>
+        </w:rPr>
+      </w:pPr>
+      <w:bookmarkStart w:id="8" w:name="_Toc225603952"/>
+      <w:r>
+        <w:rPr>
+          <w:lang w:val="uk-UA" w:eastAsia="ru-RU"/>
+        </w:rPr>
+        <w:t>Практичне застосування в рамках лабораторної роботи</w:t>
+      </w:r>
+      <w:bookmarkEnd w:id="8"/>
+    </w:p>
+    <w:p>
+      <w:pPr>
+        <w:ind w:firstLine="708"/>
+        <w:rPr>
+          <w:lang w:val="uk-UA" w:eastAsia="ru-RU"/>
+        </w:rPr>
+      </w:pPr>
+      <w:r>
+        <w:rPr>
+          <w:lang w:val="uk-UA" w:eastAsia="ru-RU"/>
+        </w:rPr>
+        <w:t>Оскільки розробка ведеться не з нуля, а як продовження та вдосконалення вже існуючої</w:t>
+      </w:r>
+      <w:r>
+        <w:rPr>
+          <w:lang w:val="uk-UA" w:eastAsia="ru-RU"/>
+        </w:rPr>
+        <w:t xml:space="preserve"> роботи</w:t>
+      </w:r>
+      <w:r>
+        <w:rPr>
+          <w:lang w:val="uk-UA" w:eastAsia="ru-RU"/>
+        </w:rPr>
+        <w:t>, саме фокус на безперервному</w:t>
+      </w:r>
+      <w:r>
+        <w:rPr>
+          <w:lang w:val="uk-UA" w:eastAsia="ru-RU"/>
+        </w:rPr>
+        <w:t xml:space="preserve"> </w:t>
+      </w:r>
+      <w:proofErr w:type="spellStart"/>
+      <w:r>
+        <w:rPr>
+          <w:lang w:val="uk-UA" w:eastAsia="ru-RU"/>
+        </w:rPr>
+        <w:t>рефакторингу</w:t>
+      </w:r>
+      <w:proofErr w:type="spellEnd"/>
+      <w:r>
+        <w:rPr>
+          <w:lang w:val="uk-UA" w:eastAsia="ru-RU"/>
+        </w:rPr>
+        <w:t xml:space="preserve"> дозволяє легально</w:t>
+      </w:r>
+      <w:r>
+        <w:rPr>
+          <w:lang w:val="uk-UA" w:eastAsia="ru-RU"/>
+        </w:rPr>
+        <w:t xml:space="preserve"> та безпечно змінювати архітектуру програми для</w:t>
+      </w:r>
+      <w:r>
+        <w:rPr>
+          <w:lang w:val="uk-UA" w:eastAsia="ru-RU"/>
+        </w:rPr>
+        <w:t xml:space="preserve"> впровадження нових фізичних або </w:t>
+      </w:r>
+      <w:r>
+        <w:rPr>
+          <w:lang w:val="uk-UA" w:eastAsia="ru-RU"/>
+        </w:rPr>
+        <w:t xml:space="preserve">графічних </w:t>
+      </w:r>
+      <w:r>
+        <w:rPr>
+          <w:lang w:val="uk-UA" w:eastAsia="ru-RU"/>
+        </w:rPr>
+        <w:t>функцій.</w:t>
+      </w:r>
+    </w:p>
+    <w:p>
+      <w:pPr>
+        <w:ind w:firstLine="708"/>
+        <w:rPr>
+          <w:lang w:val="uk-UA" w:eastAsia="ru-RU"/>
+        </w:rPr>
+      </w:pPr>
+      <w:bookmarkStart w:id="9" w:name="_GoBack"/>
+      <w:bookmarkEnd w:id="9"/>
+      <w:r>
+        <w:rPr>
+          <w:lang w:val="uk-UA" w:eastAsia="ru-RU"/>
+        </w:rPr>
+        <w:t xml:space="preserve">Завдяки методології XP, </w:t>
+      </w:r>
+      <w:r>
+        <w:rPr>
+          <w:lang w:val="uk-UA" w:eastAsia="ru-RU"/>
+        </w:rPr>
+        <w:t xml:space="preserve">подальший </w:t>
+      </w:r>
+      <w:r>
+        <w:rPr>
+          <w:lang w:val="uk-UA" w:eastAsia="ru-RU"/>
+        </w:rPr>
+        <w:t xml:space="preserve">процес розробки та модернізації додатку </w:t>
+      </w:r>
+      <w:r>
+        <w:rPr>
+          <w:lang w:val="uk-UA" w:eastAsia="ru-RU"/>
+        </w:rPr>
+        <w:t xml:space="preserve">може бути </w:t>
+      </w:r>
+      <w:r>
+        <w:rPr>
+          <w:lang w:val="uk-UA" w:eastAsia="ru-RU"/>
+        </w:rPr>
+        <w:t>побуд</w:t>
+      </w:r>
+      <w:r>
+        <w:rPr>
+          <w:lang w:val="uk-UA" w:eastAsia="ru-RU"/>
+        </w:rPr>
+        <w:t>ований</w:t>
+      </w:r>
+      <w:r>
+        <w:rPr>
+          <w:lang w:val="uk-UA" w:eastAsia="ru-RU"/>
+        </w:rPr>
+        <w:t xml:space="preserve"> наступним</w:t>
+      </w:r>
+      <w:r>
+        <w:rPr>
+          <w:lang w:val="uk-UA" w:eastAsia="ru-RU"/>
+        </w:rPr>
+        <w:t xml:space="preserve"> чином</w:t>
+      </w:r>
+      <w:r>
+        <w:rPr>
+          <w:lang w:val="uk-UA" w:eastAsia="ru-RU"/>
+        </w:rPr>
+        <w:t>:</w:t>
+      </w:r>
+    </w:p>
+    <w:p>
+      <w:pPr>
+        <w:pStyle w:val="ab"/>
+        <w:numPr>
+          <w:ilvl w:val="0"/>
+          <w:numId w:val="2"/>
+        </w:numPr>
+        <w:rPr>
+          <w:lang w:val="uk-UA" w:eastAsia="ru-RU"/>
+        </w:rPr>
+      </w:pPr>
+      <w:r>
+        <w:rPr>
+          <w:lang w:val="uk-UA" w:eastAsia="ru-RU"/>
+        </w:rPr>
+        <w:t>Виявлення вузьких місць у попередній версії програми (</w:t>
+      </w:r>
+      <w:r>
+        <w:rPr>
+          <w:lang w:val="uk-UA" w:eastAsia="ru-RU"/>
+        </w:rPr>
+        <w:t>помилки у її роботі, неоптимальні рішення, тощо)</w:t>
+      </w:r>
+      <w:r>
+        <w:rPr>
+          <w:lang w:val="uk-UA" w:eastAsia="ru-RU"/>
+        </w:rPr>
+        <w:t>.</w:t>
+      </w:r>
+    </w:p>
+    <w:p>
+      <w:pPr>
+        <w:pStyle w:val="ab"/>
+        <w:numPr>
+          <w:ilvl w:val="0"/>
+          <w:numId w:val="2"/>
+        </w:numPr>
+        <w:rPr>
+          <w:lang w:val="uk-UA" w:eastAsia="ru-RU"/>
+        </w:rPr>
+      </w:pPr>
+      <w:r>
+        <w:rPr>
+          <w:lang w:val="uk-UA" w:eastAsia="ru-RU"/>
+        </w:rPr>
+        <w:t>П</w:t>
+      </w:r>
+      <w:r>
+        <w:rPr>
+          <w:lang w:val="uk-UA" w:eastAsia="ru-RU"/>
+        </w:rPr>
+        <w:t>овна зміна підходу до обчислень</w:t>
+      </w:r>
+      <w:r>
+        <w:rPr>
+          <w:lang w:val="uk-UA" w:eastAsia="ru-RU"/>
+        </w:rPr>
+        <w:t>. Зміна формул та формату даних, які обчислювальний модуль віддає у графічний інтерфейс, при цьому зберігаючи саму працездатність модуля зв'язку</w:t>
+      </w:r>
+      <w:r>
+        <w:rPr>
+          <w:lang w:val="uk-UA" w:eastAsia="ru-RU"/>
+        </w:rPr>
+        <w:t xml:space="preserve"> без внесення критичних змін у його роботу</w:t>
+      </w:r>
+      <w:r>
+        <w:rPr>
+          <w:lang w:val="uk-UA" w:eastAsia="ru-RU"/>
+        </w:rPr>
+        <w:t>.</w:t>
+      </w:r>
+    </w:p>
+    <w:p>
+      <w:pPr>
+        <w:pStyle w:val="ab"/>
+        <w:numPr>
+          <w:ilvl w:val="0"/>
+          <w:numId w:val="2"/>
+        </w:numPr>
+        <w:rPr>
+          <w:lang w:val="uk-UA" w:eastAsia="ru-RU"/>
+        </w:rPr>
+      </w:pPr>
+      <w:r>
+        <w:rPr>
+          <w:lang w:val="uk-UA" w:eastAsia="ru-RU"/>
+        </w:rPr>
+        <w:t xml:space="preserve">Додавання нових </w:t>
+      </w:r>
+      <w:proofErr w:type="spellStart"/>
+      <w:r>
+        <w:rPr>
+          <w:lang w:val="uk-UA" w:eastAsia="ru-RU"/>
+        </w:rPr>
+        <w:t>фіч</w:t>
+      </w:r>
+      <w:proofErr w:type="spellEnd"/>
+      <w:r>
+        <w:rPr>
+          <w:lang w:val="uk-UA" w:eastAsia="ru-RU"/>
+        </w:rPr>
+        <w:t xml:space="preserve"> на вже оновлену програму</w:t>
+      </w:r>
+      <w:r>
+        <w:rPr>
+          <w:lang w:val="uk-UA" w:eastAsia="ru-RU"/>
+        </w:rPr>
+        <w:t xml:space="preserve">. Це </w:t>
+      </w:r>
+      <w:r>
+        <w:rPr>
+          <w:lang w:val="uk-UA" w:eastAsia="ru-RU"/>
+        </w:rPr>
+        <w:t xml:space="preserve">може бути </w:t>
+      </w:r>
+      <w:proofErr w:type="spellStart"/>
+      <w:r>
+        <w:rPr>
+          <w:lang w:val="uk-UA" w:eastAsia="ru-RU"/>
+        </w:rPr>
+        <w:t>валідація</w:t>
+      </w:r>
+      <w:proofErr w:type="spellEnd"/>
+      <w:r>
+        <w:rPr>
+          <w:lang w:val="uk-UA" w:eastAsia="ru-RU"/>
+        </w:rPr>
+        <w:t xml:space="preserve"> вхідних даних, додавання інформаційних панелей (вивід розраховано</w:t>
+      </w:r>
+      <w:r>
+        <w:rPr>
+          <w:lang w:val="uk-UA" w:eastAsia="ru-RU"/>
+        </w:rPr>
+        <w:t>го часу та дальності польоту), тощо</w:t>
+      </w:r>
+      <w:r>
+        <w:rPr>
+          <w:lang w:val="uk-UA" w:eastAsia="ru-RU"/>
+        </w:rPr>
+        <w:t>.</w:t>
       </w:r>
     </w:p>
     <w:p>
@@ -2419,14 +3012,14 @@
           <w:lang w:val="uk-UA"/>
         </w:rPr>
       </w:pPr>
-      <w:bookmarkStart w:id="6" w:name="_Toc225270441"/>
+      <w:bookmarkStart w:id="10" w:name="_Toc225603953"/>
       <w:r>
         <w:rPr>
           <w:lang w:val="uk-UA"/>
         </w:rPr>
         <w:t>Фізична/математична модель руху</w:t>
       </w:r>
-      <w:bookmarkEnd w:id="6"/>
+      <w:bookmarkEnd w:id="10"/>
     </w:p>
     <w:p>
       <w:pPr>
@@ -3392,7 +3985,7 @@
           <w:lang w:val="uk-UA"/>
         </w:rPr>
       </w:pPr>
-      <w:bookmarkStart w:id="7" w:name="_Toc225270442"/>
+      <w:bookmarkStart w:id="11" w:name="_Toc225603954"/>
       <w:r>
         <w:rPr>
           <w:rStyle w:val="citation-111"/>
@@ -3400,7 +3993,7 @@
         </w:rPr>
         <w:t>Умова завершення польоту</w:t>
       </w:r>
-      <w:bookmarkEnd w:id="7"/>
+      <w:bookmarkEnd w:id="11"/>
     </w:p>
     <w:p>
       <w:pPr>
@@ -3616,7 +4209,7 @@
           <w:lang w:val="uk-UA"/>
         </w:rPr>
       </w:pPr>
-      <w:bookmarkStart w:id="8" w:name="_Toc225270443"/>
+      <w:bookmarkStart w:id="12" w:name="_Toc225603955"/>
       <w:r>
         <w:rPr>
           <w:rFonts w:eastAsiaTheme="minorEastAsia"/>
@@ -3624,7 +4217,7 @@
         </w:rPr>
         <w:t>Програмна реалізація алгоритму</w:t>
       </w:r>
-      <w:bookmarkEnd w:id="8"/>
+      <w:bookmarkEnd w:id="12"/>
     </w:p>
     <w:p>
       <w:pPr>
@@ -4176,7 +4769,7 @@
           <w:lang w:val="uk-UA"/>
         </w:rPr>
       </w:pPr>
-      <w:bookmarkStart w:id="9" w:name="_Toc225270444"/>
+      <w:bookmarkStart w:id="13" w:name="_Toc225603956"/>
       <w:r>
         <w:rPr>
           <w:rFonts w:eastAsiaTheme="minorEastAsia"/>
@@ -4198,7 +4791,7 @@
         </w:rPr>
         <w:t>)</w:t>
       </w:r>
-      <w:bookmarkEnd w:id="9"/>
+      <w:bookmarkEnd w:id="13"/>
     </w:p>
     <w:p>
       <w:pPr>
@@ -4260,7 +4853,7 @@
         <mc:AlternateContent>
           <mc:Choice Requires="wpc">
             <w:drawing>
-              <wp:inline distT="0" distB="0" distL="0" distR="0" wp14:anchorId="0C0E36CB" wp14:editId="1858CE89">
+              <wp:inline distT="0" distB="0" distL="0" distR="0" wp14:anchorId="5B622E08" wp14:editId="608CC118">
                 <wp:extent cx="5935345" cy="2893697"/>
                 <wp:effectExtent l="0" t="0" r="27305" b="40005"/>
                 <wp:docPr id="1" name="Полотно 1"/>
@@ -5965,7 +6558,7 @@
           </mc:Choice>
           <mc:Fallback>
             <w:pict>
-              <v:group w14:anchorId="0C0E36CB" id="Полотно 1" o:spid="_x0000_s1026" editas="canvas" style="width:467.35pt;height:227.85pt;mso-position-horizontal-relative:char;mso-position-vertical-relative:line" coordsize="59353,28936" o:gfxdata="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">
+              <v:group w14:anchorId="5B622E08" id="Полотно 1" o:spid="_x0000_s1026" editas="canvas" style="width:467.35pt;height:227.85pt;mso-position-horizontal-relative:char;mso-position-vertical-relative:line" coordsize="59353,28936" o:gfxdata="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">
                 <v:shapetype id="_x0000_t75" coordsize="21600,21600" o:spt="75" o:preferrelative="t" path="m@4@5l@4@11@9@11@9@5xe" filled="f" stroked="f">
                   <v:stroke joinstyle="miter"/>
                   <v:formulas>
@@ -6654,7 +7247,7 @@
           <w:lang w:val="uk-UA"/>
         </w:rPr>
       </w:pPr>
-      <w:bookmarkStart w:id="10" w:name="_Toc225270445"/>
+      <w:bookmarkStart w:id="14" w:name="_Toc225603957"/>
       <w:r>
         <w:rPr>
           <w:lang w:val="uk-UA"/>
@@ -6662,7 +7255,7 @@
         <w:lastRenderedPageBreak/>
         <w:t>Висновок</w:t>
       </w:r>
-      <w:bookmarkEnd w:id="10"/>
+      <w:bookmarkEnd w:id="14"/>
     </w:p>
     <w:p>
       <w:pPr>
@@ -6755,15 +7348,7 @@
         <w:rPr>
           <w:lang w:val="uk-UA" w:eastAsia="ru-RU"/>
         </w:rPr>
-        <w:t xml:space="preserve"> (фактично, немає необхідності </w:t>
-      </w:r>
-      <w:bookmarkStart w:id="11" w:name="_GoBack"/>
-      <w:bookmarkEnd w:id="11"/>
-      <w:r>
-        <w:rPr>
-          <w:lang w:val="uk-UA" w:eastAsia="ru-RU"/>
-        </w:rPr>
-        <w:t xml:space="preserve">робити 5 </w:t>
+        <w:t xml:space="preserve"> (фактично, немає необхідності робити 5 </w:t>
       </w:r>
       <w:proofErr w:type="spellStart"/>
       <w:r>
@@ -6860,7 +7445,7 @@
           <w:rPr>
             <w:noProof/>
           </w:rPr>
-          <w:t>6</w:t>
+          <w:t>7</w:t>
         </w:r>
         <w:r>
           <w:fldChar w:fldCharType="end"/>
@@ -7944,17 +8529,17 @@
     <w:uiPriority w:val="9"/>
     <w:unhideWhenUsed/>
     <w:qFormat/>
-    <w:rsid w:val="009C0F0D"/>
+    <w:rsid w:val="00303CD0"/>
     <w:pPr>
       <w:keepNext/>
       <w:keepLines/>
-      <w:spacing w:before="40"/>
+      <w:jc w:val="center"/>
       <w:outlineLvl w:val="2"/>
     </w:pPr>
     <w:rPr>
-      <w:rFonts w:asciiTheme="majorHAnsi" w:eastAsiaTheme="majorEastAsia" w:hAnsiTheme="majorHAnsi" w:cstheme="majorBidi"/>
-      <w:color w:val="1F4D78" w:themeColor="accent1" w:themeShade="7F"/>
-      <w:sz w:val="24"/>
+      <w:rFonts w:eastAsiaTheme="majorEastAsia" w:cstheme="majorBidi"/>
+      <w:b/>
+      <w:color w:val="000000" w:themeColor="text1"/>
       <w:szCs w:val="24"/>
     </w:rPr>
   </w:style>
@@ -8343,11 +8928,12 @@
     <w:basedOn w:val="a0"/>
     <w:link w:val="3"/>
     <w:uiPriority w:val="9"/>
-    <w:rsid w:val="009C0F0D"/>
+    <w:rsid w:val="00303CD0"/>
     <w:rPr>
-      <w:rFonts w:asciiTheme="majorHAnsi" w:eastAsiaTheme="majorEastAsia" w:hAnsiTheme="majorHAnsi" w:cstheme="majorBidi"/>
-      <w:color w:val="1F4D78" w:themeColor="accent1" w:themeShade="7F"/>
-      <w:sz w:val="24"/>
+      <w:rFonts w:ascii="Times New Roman" w:eastAsiaTheme="majorEastAsia" w:hAnsi="Times New Roman" w:cstheme="majorBidi"/>
+      <w:b/>
+      <w:color w:val="000000" w:themeColor="text1"/>
+      <w:sz w:val="28"/>
       <w:szCs w:val="24"/>
     </w:rPr>
   </w:style>
@@ -8400,6 +8986,33 @@
       <w:i/>
       <w:iCs/>
       <w:color w:val="1F4D78" w:themeColor="accent1" w:themeShade="7F"/>
+      <w:sz w:val="28"/>
+    </w:rPr>
+  </w:style>
+  <w:style w:type="paragraph" w:styleId="31">
+    <w:name w:val="toc 3"/>
+    <w:basedOn w:val="a"/>
+    <w:next w:val="a"/>
+    <w:autoRedefine/>
+    <w:uiPriority w:val="39"/>
+    <w:unhideWhenUsed/>
+    <w:rsid w:val="00356793"/>
+    <w:pPr>
+      <w:spacing w:after="100"/>
+      <w:ind w:left="560"/>
+    </w:pPr>
+  </w:style>
+  <w:style w:type="paragraph" w:styleId="ad">
+    <w:name w:val="No Spacing"/>
+    <w:uiPriority w:val="1"/>
+    <w:qFormat/>
+    <w:rsid w:val="00D136CA"/>
+    <w:pPr>
+      <w:spacing w:after="0" w:line="240" w:lineRule="auto"/>
+      <w:jc w:val="both"/>
+    </w:pPr>
+    <w:rPr>
+      <w:rFonts w:ascii="Times New Roman" w:hAnsi="Times New Roman"/>
       <w:sz w:val="28"/>
     </w:rPr>
   </w:style>
@@ -8672,7 +9285,7 @@
 </file>
 
 <file path=customXml/itemProps1.xml><?xml version="1.0" encoding="utf-8"?>
-<ds:datastoreItem xmlns:ds="http://schemas.openxmlformats.org/officeDocument/2006/customXml" ds:itemID="{23F31A6D-F0D7-4D82-A024-FE3E91C6786A}">
+<ds:datastoreItem xmlns:ds="http://schemas.openxmlformats.org/officeDocument/2006/customXml" ds:itemID="{4B0F281C-BCE8-4354-BB61-C2E16996A951}">
   <ds:schemaRefs>
     <ds:schemaRef ds:uri="http://schemas.openxmlformats.org/officeDocument/2006/bibliography"/>
   </ds:schemaRefs>

</xml_diff>